<commit_message>
Add executable qBraid submission wrapper (Platform Use, criterion 5/6)
qbraid_submit.py runs the verified gate-Trotter CHIMERA circuit on a PennyLane
simulator now, one flag (--device) from a real qBraid/IonQ/IQM/IBM backend:
- classical cross-check: exact circuit vs NumPy engine = 3.9e-16 (PASS) - the
  circuit IS the reservoir;
- shot-budget characterization: mean feature error 0.046/0.025/0.013/0.0066 at
  S=256/1k/4k/16k shots (epsilon ~ 1/sqrt(S)); single Z-basis measurement yields
  all n+C(n,2) observables; Trotter(20) approximation ~0.04;
- ZNE demonstration: linear zero-noise extrapolation over a depolarizing sweep
  recovers toward the noiseless value.
Wired into cli.py (run qsubmit) + qbraid_skill.yaml + SKILL.md; paper section 6 and
README updated with the measured numbers. Paper still 5 pages.

Co-Authored-By: Claude Opus 4.8 <noreply@anthropic.com>
Claude-Session: https://claude.ai/code/session_01SH3wHCzTCUP7HwrV3NZtab
</commit_message>
<xml_diff>
--- a/PHASE3_PAPER.docx
+++ b/PHASE3_PAPER.docx
@@ -2483,7 +2483,7 @@
         <w:jc w:val="both"/>
       </w:pPr>
       <w:r>
-        <w:t>mapping (trapped-ion all-to-all natively supports the arbitrary couplings) — with **ZNE (Mitiq)</w:t>
+        <w:t>mapping (trapped-ion all-to-all natively supports the arbitrary couplings) — with **ZNE +</w:t>
       </w:r>
     </w:p>
     <w:p>
@@ -2491,7 +2491,7 @@
         <w:jc w:val="both"/>
       </w:pPr>
       <w:r>
-        <w:t>+ measurement mitigation (mthree)** and a classical cross-check for every run. We characterize</w:t>
+        <w:t>measurement mitigation** and a classical cross-check for every run. The submission path is</w:t>
       </w:r>
     </w:p>
     <w:p>
@@ -2499,7 +2499,31 @@
         <w:jc w:val="both"/>
       </w:pPr>
       <w:r>
-        <w:t>all four challenge axes: reservoir size (§5.1/5.5), encoding density (§5.2/5.3), shot budget</w:t>
+        <w:rPr>
+          <w:b/>
+        </w:rPr>
+        <w:t>executable now</w:t>
+      </w:r>
+      <w:r>
+        <w:t xml:space="preserve"> (</w:t>
+      </w:r>
+      <w:r>
+        <w:rPr>
+          <w:rFonts w:ascii="Courier New" w:hAnsi="Courier New"/>
+        </w:rPr>
+        <w:t>qbraid_submit.py</w:t>
+      </w:r>
+      <w:r>
+        <w:t xml:space="preserve">, </w:t>
+      </w:r>
+      <w:r>
+        <w:rPr>
+          <w:rFonts w:ascii="Courier New" w:hAnsi="Courier New"/>
+        </w:rPr>
+        <w:t>cli.py run qsubmit</w:t>
+      </w:r>
+      <w:r>
+        <w:t>): on a simulator it (i) reproduces</w:t>
       </w:r>
     </w:p>
     <w:p>
@@ -2507,7 +2531,99 @@
         <w:jc w:val="both"/>
       </w:pPr>
       <w:r>
-        <w:t>(above), and noise (§5.4). *(QCi Dirac-3 is the separate optimization challenge's device.)*</w:t>
+        <w:t xml:space="preserve">the engine to </w:t>
+      </w:r>
+      <w:r>
+        <w:rPr>
+          <w:b/>
+        </w:rPr>
+        <w:t>3.9×10⁻¹⁶</w:t>
+      </w:r>
+      <w:r>
+        <w:t xml:space="preserve"> via the exact circuit (the classical cross-check we run for every</w:t>
+      </w:r>
+    </w:p>
+    <w:p>
+      <w:pPr>
+        <w:jc w:val="both"/>
+      </w:pPr>
+      <w:r>
+        <w:t xml:space="preserve">hardware execution), (ii) characterizes the </w:t>
+      </w:r>
+      <w:r>
+        <w:rPr>
+          <w:b/>
+        </w:rPr>
+        <w:t>shot budget</w:t>
+      </w:r>
+      <w:r>
+        <w:t xml:space="preserve"> — mean feature error 0.046 / 0.013</w:t>
+      </w:r>
+    </w:p>
+    <w:p>
+      <w:pPr>
+        <w:jc w:val="both"/>
+      </w:pPr>
+      <w:r>
+        <w:t>/ 0.0066 at S = 256 / 4k / 16k shots, the ε≈1/√S law, with the gate-Trotter(20) approximation</w:t>
+      </w:r>
+    </w:p>
+    <w:p>
+      <w:pPr>
+        <w:jc w:val="both"/>
+      </w:pPr>
+      <w:r>
+        <w:t xml:space="preserve">adding ≈0.04 — and (iii) demonstrates </w:t>
+      </w:r>
+      <w:r>
+        <w:rPr>
+          <w:b/>
+        </w:rPr>
+        <w:t>zero-noise extrapolation</w:t>
+      </w:r>
+      <w:r>
+        <w:t xml:space="preserve"> recovering toward the</w:t>
+      </w:r>
+    </w:p>
+    <w:p>
+      <w:pPr>
+        <w:jc w:val="both"/>
+      </w:pPr>
+      <w:r>
+        <w:t>noiseless value under a depolarizing sweep. It is one flag (</w:t>
+      </w:r>
+      <w:r>
+        <w:rPr>
+          <w:rFonts w:ascii="Courier New" w:hAnsi="Courier New"/>
+        </w:rPr>
+        <w:t>--device</w:t>
+      </w:r>
+      <w:r>
+        <w:t>) from a real backend,</w:t>
+      </w:r>
+    </w:p>
+    <w:p>
+      <w:pPr>
+        <w:jc w:val="both"/>
+      </w:pPr>
+      <w:r>
+        <w:t>pending qBraid credit allocation. We thus characterize all four challenge axes: reservoir size</w:t>
+      </w:r>
+    </w:p>
+    <w:p>
+      <w:pPr>
+        <w:jc w:val="both"/>
+      </w:pPr>
+      <w:r>
+        <w:t>(§5.1/5.5), encoding density (§5.2/5.3), shot budget, and noise (§5.4). *(QCi Dirac-3 is the</w:t>
+      </w:r>
+    </w:p>
+    <w:p>
+      <w:pPr>
+        <w:jc w:val="both"/>
+      </w:pPr>
+      <w:r>
+        <w:t>separate optimization challenge's device.)*</w:t>
       </w:r>
     </w:p>
     <w:p>

</xml_diff>

<commit_message>
paper: fold banked hardware findings into section 6 (pre-campaign state)
- IonQ/IQM/IBM -> IonQ/IQM/Rigetti (the actually-executed platform set)
- adds the platform-level negative-angle finding (identity pair executed
  as net RY(pi); client-side JSON provably correct), the hardened
  emitter, and its on-device validation (P(|0^8>)=0.996 vs 0.0 pre-fix)
- adds the first Garnet reservoir window (raw 0.238, readout 0.6%/3.6%)
  replicating the Rigetti regime on a second superconducting vendor,
  and the trapped-ion readout contrast (~0.4%/qubit)
- 'queued' status -> funded campaigns executing under the pre-committed
  manifest (results/qpu_campaign_manifest.md)
- section 7(v) updated to match
Verified: rebuild at exactly 5 pages, zero tofu, page-4 visual check.

Co-Authored-By: Claude Fable 5 <noreply@anthropic.com>
Claude-Session: https://claude.ai/code/session_01SH3wHCzTCUP7HwrV3NZtab
</commit_message>
<xml_diff>
--- a/PHASE3_PAPER.docx
+++ b/PHASE3_PAPER.docx
@@ -2434,7 +2434,7 @@
         <w:rPr>
           <w:b/>
         </w:rPr>
-        <w:t>IonQ / IQM / IBM</w:t>
+        <w:t>IonQ / IQM / Rigetti</w:t>
       </w:r>
       <w:r>
         <w:t xml:space="preserve"> via qBraid — the random-sparse Ising needs </w:t>
@@ -2527,7 +2527,52 @@
         <w:t>Rigetti Cepheus-1-108q</w:t>
       </w:r>
       <w:r>
-        <w:t xml:space="preserve"> (12 logged cloud jobs; little-endian bit order auto-detected; measured readout errors 2.3%/6.4%): after lattice routing the scale-1 circuit already exceeds the coherence budget (raw feature error 0.261 vs the 0.196 fully-depolarized limit), so folded ZNE cannot recover — measuring on metal exactly the accumulated two-qubit-gate cost §5.4 predicts; the routing-free trapped-ion run (IonQ Forte-1, all-to-all; hardware probe P(|1⟩⁸)=0.97) is queued (</w:t>
+        <w:t xml:space="preserve"> (12 logged cloud jobs; little-endian bit order auto-detected; measured readout errors 2.3%/6.4%): after lattice routing the scale-1 circuit already exceeds the coherence budget (raw feature error 0.261 vs the 0.196 fully-depolarized limit), so folded ZNE cannot recover — measuring on metal exactly the accumulated two-qubit-gate cost §5.4 predicts. A first </w:t>
+      </w:r>
+      <w:r>
+        <w:rPr>
+          <w:b/>
+        </w:rPr>
+        <w:t>IQM Garnet</w:t>
+      </w:r>
+      <w:r>
+        <w:t xml:space="preserve"> reservoir window replicates this regime on a second superconducting vendor (raw 0.238; readout 0.6%/3.6%), while cross-platform execution surfaced a </w:t>
+      </w:r>
+      <w:r>
+        <w:rPr>
+          <w:b/>
+        </w:rPr>
+        <w:t>platform-level finding</w:t>
+      </w:r>
+      <w:r>
+        <w:t xml:space="preserve">: an RY(π)RY(−π) identity pair executed as </w:t>
+      </w:r>
+      <w:r>
+        <w:rPr>
+          <w:b/>
+        </w:rPr>
+        <w:t>net RY(π)</w:t>
+      </w:r>
+      <w:r>
+        <w:t xml:space="preserve"> on the IonQ route — the client-side IonQ JSON provably contained both signed rotations, so negative-angle gates are lost server-side, which would silently corrupt ZNE's negated fold gates. We hardened the emitter (angles mod 2π; diagonal-only |0…0⟩ calibration, exact under </w:t>
+      </w:r>
+      <w:r>
+        <w:rPr>
+          <w:i/>
+        </w:rPr>
+        <w:t>any</w:t>
+      </w:r>
+      <w:r>
+        <w:t xml:space="preserve"> subset of gates executing) and validated the fix on-device: P(|0⁸⟩)=0.996 vs 0.0 pre-fix, with trapped-ion readout ≈0.4%/qubit — the device-class contrast §5.4 anticipates. The full pre-registered 4k-shot Garnet protocol and the decisive routing-free IonQ Forte-1 campaign are funded and in execution under a pre-committed manifest (per-job budget, abort rules: </w:t>
+      </w:r>
+      <w:r>
+        <w:rPr>
+          <w:rFonts w:ascii="Courier New" w:hAnsi="Courier New"/>
+        </w:rPr>
+        <w:t>results/qpu_campaign_manifest.md</w:t>
+      </w:r>
+      <w:r>
+        <w:t xml:space="preserve">; predictions committed before execution: </w:t>
       </w:r>
       <w:r>
         <w:rPr>
@@ -2536,7 +2581,7 @@
         <w:t>results/qpu_hardware_findings.md</w:t>
       </w:r>
       <w:r>
-        <w:t>, with pre-registered predictions committed before execution). We thus characterize all four challenge axes: reservoir size, encoding density, shot budget, and noise.</w:t>
+        <w:t>). We thus characterize all four challenge axes: reservoir size, encoding density, shot budget, and noise.</w:t>
       </w:r>
     </w:p>
     <w:p>
@@ -2561,7 +2606,7 @@
         <w:t>No quantum advantage</w:t>
       </w:r>
       <w:r>
-        <w:t xml:space="preserve"> is demonstrated at the ≤16-qubit simulable scale; HAR-X (classical, linear) is the best model on this task. (ii) The RV sample ends Feb-2020 (2008 GFC in-sample, 2020 COVID just outside); broader assets/periods are covered only by daily-proxy supporting studies (v2_research: cross-asset, COVID — same negative), not 5-min RV. (iii) Task-level noise is characterized via per-layer single-qubit channels (density-matrix, §5.4) and simulator shot noise (§6); combined noisy-circuit-plus-shot execution is deferred to QPU runs. (iv) g is regularization- and run-configuration-dependent (qualitative gap only). (v) Hardware execution (Rigetti, §6) is a </w:t>
+        <w:t xml:space="preserve"> is demonstrated at the ≤16-qubit simulable scale; HAR-X (classical, linear) is the best model on this task. (ii) The RV sample ends Feb-2020 (2008 GFC in-sample, 2020 COVID just outside); broader assets/periods are covered only by daily-proxy supporting studies (v2_research: cross-asset, COVID — same negative), not 5-min RV. (iii) Task-level noise is characterized via per-layer single-qubit channels (density-matrix, §5.4) and simulator shot noise (§6); combined noisy-circuit-plus-shot execution is deferred to QPU runs. (iv) g is regularization- and run-configuration-dependent (qualitative gap only). (v) Hardware execution (Rigetti + first Garnet window, §6) is a </w:t>
       </w:r>
       <w:r>
         <w:rPr>
@@ -2579,7 +2624,7 @@
         <w:t>recovery</w:t>
       </w:r>
       <w:r>
-        <w:t xml:space="preserve"> remains unvalidated on hardware (trapped-ion run queued). (vi) Distinctness and full-rank entanglement are </w:t>
+        <w:t xml:space="preserve"> remains unvalidated on hardware (trapped-ion campaign in execution). (vi) Distinctness and full-rank entanglement are </w:t>
       </w:r>
       <w:r>
         <w:rPr>

</xml_diff>

<commit_message>
paper: fold executed Garnet campaign result into section 6
Replaces the single-window preview + 'in execution' status with the
completed 12-job result: raw 0.230 beyond the 0.196 limit and above
the routing-free 0.171 forecast (prediction (iii) confirmed, ZNE
recovery non-monotone) - second-vendor replication of the regime.
Section 7(v) updated to match. Rebuilt: exactly 5 pages, zero tofu.

Co-Authored-By: Claude Fable 5 <noreply@anthropic.com>
Claude-Session: https://claude.ai/code/session_01SH3wHCzTCUP7HwrV3NZtab
</commit_message>
<xml_diff>
--- a/PHASE3_PAPER.docx
+++ b/PHASE3_PAPER.docx
@@ -2527,16 +2527,25 @@
         <w:t>Rigetti Cepheus-1-108q</w:t>
       </w:r>
       <w:r>
-        <w:t xml:space="preserve"> (12 logged cloud jobs; little-endian bit order auto-detected; measured readout errors 2.3%/6.4%): after lattice routing the scale-1 circuit already exceeds the coherence budget (raw feature error 0.261 vs the 0.196 fully-depolarized limit), so folded ZNE cannot recover — measuring on metal exactly the accumulated two-qubit-gate cost §5.4 predicts. A first </w:t>
+        <w:t xml:space="preserve"> (12 logged cloud jobs; little-endian bit order auto-detected; measured readout errors 2.3%/6.4%): after lattice routing the scale-1 circuit already exceeds the coherence budget (raw feature error 0.261 vs the 0.196 fully-depolarized limit), so folded ZNE cannot recover — measuring on metal exactly the accumulated two-qubit-gate cost §5.4 predicts. The </w:t>
       </w:r>
       <w:r>
         <w:rPr>
           <w:b/>
         </w:rPr>
-        <w:t>IQM Garnet</w:t>
-      </w:r>
-      <w:r>
-        <w:t xml:space="preserve"> reservoir window replicates this regime on a second superconducting vendor (raw 0.238; readout 0.6%/3.6%), while cross-platform execution surfaced a </w:t>
+        <w:t>full pre-registered 4k-shot Garnet protocol</w:t>
+      </w:r>
+      <w:r>
+        <w:t xml:space="preserve"> then executed (12 jobs): raw 0.230 — beyond the 0.196 limit and above our routing-free 0.171 forecast (</w:t>
+      </w:r>
+      <w:r>
+        <w:rPr>
+          <w:b/>
+        </w:rPr>
+        <w:t>prediction (iii) confirmed</w:t>
+      </w:r>
+      <w:r>
+        <w:t xml:space="preserve">; ZNE recovery non-monotone) — replicating this regime on a second superconducting vendor (readout 0.4%/3.2%). Cross-platform execution also surfaced a </w:t>
       </w:r>
       <w:r>
         <w:rPr>
@@ -2563,7 +2572,7 @@
         <w:t>any</w:t>
       </w:r>
       <w:r>
-        <w:t xml:space="preserve"> subset of gates executing) and validated the fix on-device: P(|0⁸⟩)=0.996 vs 0.0 pre-fix, with trapped-ion readout ≈0.4%/qubit — the device-class contrast §5.4 anticipates. The full pre-registered 4k-shot Garnet protocol and the decisive routing-free IonQ Forte-1 campaign are funded and in execution under a pre-committed manifest (per-job budget, abort rules: </w:t>
+        <w:t xml:space="preserve"> subset of gates executing) and validated the fix on-device: P(|0⁸⟩)=0.996 vs 0.0 pre-fix, with trapped-ion readout ≈0.4%/qubit — the device-class contrast §5.4 anticipates. The decisive routing-free IonQ Forte-1 campaign is funded and gated under a pre-committed manifest (per-job budget, abort rules: </w:t>
       </w:r>
       <w:r>
         <w:rPr>
@@ -2606,7 +2615,7 @@
         <w:t>No quantum advantage</w:t>
       </w:r>
       <w:r>
-        <w:t xml:space="preserve"> is demonstrated at the ≤16-qubit simulable scale; HAR-X (classical, linear) is the best model on this task. (ii) The RV sample ends Feb-2020 (2008 GFC in-sample, 2020 COVID just outside); broader assets/periods are covered only by daily-proxy supporting studies (v2_research: cross-asset, COVID — same negative), not 5-min RV. (iii) Task-level noise is characterized via per-layer single-qubit channels (density-matrix, §5.4) and simulator shot noise (§6); combined noisy-circuit-plus-shot execution is deferred to QPU runs. (iv) g is regularization- and run-configuration-dependent (qualitative gap only). (v) Hardware execution (Rigetti + first Garnet window, §6) is a </w:t>
+        <w:t xml:space="preserve"> is demonstrated at the ≤16-qubit simulable scale; HAR-X (classical, linear) is the best model on this task. (ii) The RV sample ends Feb-2020 (2008 GFC in-sample, 2020 COVID just outside); broader assets/periods are covered only by daily-proxy supporting studies (v2_research: cross-asset, COVID — same negative), not 5-min RV. (iii) Task-level noise is characterized via per-layer single-qubit channels (density-matrix, §5.4) and simulator shot noise (§6); combined noisy-circuit-plus-shot execution is deferred to QPU runs. (iv) g is regularization- and run-configuration-dependent (qualitative gap only). (v) Hardware execution (Rigetti + Garnet full protocols, §6) is a </w:t>
       </w:r>
       <w:r>
         <w:rPr>

</xml_diff>

<commit_message>
results: Garnet n=10 EXECUTED - S1 REFUTED, first signal-bearing superconducting run
- 12 jobs, 6,754.5 cr settled exactly (probe 44.5 + 11 x 610), tag
  hw_garnet_n10; readout 0.44%/2.55% (improved vs Campaign A 3.17%)
- raw 0.1590 < n=10 depolarized limit 0.1790 (excess -0.0200): the
  executed state retains circuit signal - pre-registered S1 refuted,
  which the outlook itself commits as publishable news
- S2 leaning against (excess fell from +0.0343 at n=8; verdict at n=12);
  S4 consistent (no ZNE recovery; mitigation slightly degrades)
- confound disclosed: cross-size comparison spans days; device returned
  from likely recalibration window; same-session n=8 anchor is the clean
  discriminator - below-limit fact itself is single-day and solid
- ledger 36,723.25 / 65,000 (headroom 28,276.75); paper 6/7 fold-in,
  PDF 5 pages tofu-free visually verified

Co-Authored-By: Claude Fable 5 <noreply@anthropic.com>
Claude-Session: https://claude.ai/code/session_01SH3wHCzTCUP7HwrV3NZtab
</commit_message>
<xml_diff>
--- a/PHASE3_PAPER.docx
+++ b/PHASE3_PAPER.docx
@@ -2626,7 +2626,52 @@
         <w:t>results/qpu_hardware_findings.md</w:t>
       </w:r>
       <w:r>
-        <w:t>). We thus characterize all four challenge axes: reservoir size, encoding density, shot budget, and noise.</w:t>
+        <w:t xml:space="preserve">). A pre-registered </w:t>
+      </w:r>
+      <w:r>
+        <w:rPr>
+          <w:b/>
+        </w:rPr>
+        <w:t>hardware scaling program</w:t>
+      </w:r>
+      <w:r>
+        <w:t xml:space="preserve"> (</w:t>
+      </w:r>
+      <w:r>
+        <w:rPr>
+          <w:rFonts w:ascii="Courier New" w:hAnsi="Courier New"/>
+        </w:rPr>
+        <w:t>results/qpu_scaling_outlook.md</w:t>
+      </w:r>
+      <w:r>
+        <w:t xml:space="preserve">) then began: at </w:t>
+      </w:r>
+      <w:r>
+        <w:rPr>
+          <w:b/>
+        </w:rPr>
+        <w:t>n=10</w:t>
+      </w:r>
+      <w:r>
+        <w:t xml:space="preserve"> (same 4k-shot protocol) Garnet measured </w:t>
+      </w:r>
+      <w:r>
+        <w:rPr>
+          <w:b/>
+        </w:rPr>
+        <w:t>raw 0.159 — below the 0.179 size-matched depolarized limit</w:t>
+      </w:r>
+      <w:r>
+        <w:t xml:space="preserve">, refuting our own statement S1 and giving the </w:t>
+      </w:r>
+      <w:r>
+        <w:rPr>
+          <w:b/>
+        </w:rPr>
+        <w:t>first signal-bearing superconducting run</w:t>
+      </w:r>
+      <w:r>
+        <w:t xml:space="preserve"> (day-scale drift is a disclosed confound for the cross-size comparison; the below-limit fact stands). We thus characterize all four challenge axes: reservoir size, encoding density, shot budget, and noise.</w:t>
       </w:r>
     </w:p>
     <w:p>
@@ -2651,7 +2696,7 @@
         <w:t>No quantum advantage</w:t>
       </w:r>
       <w:r>
-        <w:t xml:space="preserve"> is demonstrated at the ≤16-qubit simulable scale; HAR-X (classical, linear) is the best model on this task. (ii) The RV sample ends Feb-2020 (2008 GFC in-sample, 2020 COVID just outside); broader assets/periods are covered only by daily-proxy supporting studies (v2_research: cross-asset, COVID — same negative), not 5-min RV. (iii) Task-level noise is characterized via per-layer single-qubit channels (density-matrix, §5.4) and simulator shot noise (§6); combined noisy-circuit-plus-shot execution is deferred to QPU runs. (iv) g is regularization- and run-configuration-dependent (qualitative gap only). (v) Superconducting execution (Rigetti twice + Garnet, §6) is a </w:t>
+        <w:t xml:space="preserve"> is demonstrated at the ≤16-qubit simulable scale; HAR-X (classical, linear) is the best model on this task. (ii) The RV sample ends Feb-2020 (2008 GFC in-sample, 2020 COVID just outside); broader assets/periods are covered only by daily-proxy supporting studies (v2_research: cross-asset, COVID — same negative), not 5-min RV. (iii) Task-level noise is characterized via per-layer single-qubit channels (density-matrix, §5.4) and simulator shot noise (§6); combined noisy-circuit-plus-shot execution is deferred to QPU runs. (iv) g is regularization- and run-configuration-dependent (qualitative gap only). (v) Superconducting execution at n=8 (Rigetti twice + Garnet, §6) is a </w:t>
       </w:r>
       <w:r>
         <w:rPr>
@@ -2660,7 +2705,16 @@
         <w:t>characterized negative</w:t>
       </w:r>
       <w:r>
-        <w:t xml:space="preserve"> — scale-1 beyond the coherence budget after routing on both days (raw 0.261→0.223 across a replication: day-scale drift exceeds shot noise; regime, not point value, is the robust claim). The trapped-ion run is signal-bearing, but mitigation </w:t>
+        <w:t xml:space="preserve"> — scale-1 beyond the coherence budget after routing on both days (raw 0.261→0.223 across a replication: day-scale drift exceeds shot noise; regime, not point value, is the robust claim) — while Garnet at n=10 landed </w:t>
+      </w:r>
+      <w:r>
+        <w:rPr>
+          <w:i/>
+        </w:rPr>
+        <w:t>inside</w:t>
+      </w:r>
+      <w:r>
+        <w:t xml:space="preserve"> the limit, so the wall is calibration- and size-dependent, not absolute. The trapped-ion run is signal-bearing, but mitigation </w:t>
       </w:r>
       <w:r>
         <w:rPr>

</xml_diff>

<commit_message>
results: Emerald n=8 EXECUTED - S3b refuted high, program COMPLETE
- 12 jobs, 7,416 cr settled exactly (probe 46 + 11 x 670), tag
  hw_emerald_n8; readout 0.24%/1.82%, best superconducting cals measured
- raw 0.1793 < limit 0.1958: signal-bearing at n=8, the size where Garnet
  scrambles (0.2216-0.2301 across two days) - S3a confirmed, S3b REFUTED
  HIGH; the wall is generation-dependent at fixed size
- caveat disclosed: cross-generation pair spans days; gap 0.042+ exceeds
  every intra-device n=8 drift band measured
- program synthesis: S1/S2/S3b refuted, S3a confirmed, S4 held - all
  pre-registered scaling statements resolved by controlled measurement
- ledger 57,648.25 / 65,000 settled, reserve 7,351.75, program closed
- paper 6/7 fold-in; PDF 5 pages, tofu-free, visually verified

Co-Authored-By: Claude Fable 5 <noreply@anthropic.com>
Claude-Session: https://claude.ai/code/session_01SH3wHCzTCUP7HwrV3NZtab
</commit_message>
<xml_diff>
--- a/PHASE3_PAPER.docx
+++ b/PHASE3_PAPER.docx
@@ -2644,7 +2644,7 @@
         <w:t>results/qpu_scaling_outlook.md</w:t>
       </w:r>
       <w:r>
-        <w:t xml:space="preserve">) then executed on Garnet: </w:t>
+        <w:t xml:space="preserve">) then executed: on Garnet, </w:t>
       </w:r>
       <w:r>
         <w:rPr>
@@ -2689,7 +2689,34 @@
         <w:t>real and drift-controlled</w:t>
       </w:r>
       <w:r>
-        <w:t>; the mechanism (instance structure vs lattice embedding) is honestly open. We thus characterize all four challenge axes: reservoir size, encoding density, shot budget, and noise.</w:t>
+        <w:t xml:space="preserve">; the mechanism (instance structure vs lattice embedding) is honestly open. Finally, </w:t>
+      </w:r>
+      <w:r>
+        <w:rPr>
+          <w:b/>
+        </w:rPr>
+        <w:t>IQM Emerald</w:t>
+      </w:r>
+      <w:r>
+        <w:t xml:space="preserve"> (54q, newer generation) at n=8 measured </w:t>
+      </w:r>
+      <w:r>
+        <w:rPr>
+          <w:b/>
+        </w:rPr>
+        <w:t>raw 0.179 &lt; 0.196</w:t>
+      </w:r>
+      <w:r>
+        <w:t xml:space="preserve"> — signal-bearing at the very size Garnet scrambles (S3b refuted high): the wall is also </w:t>
+      </w:r>
+      <w:r>
+        <w:rPr>
+          <w:b/>
+        </w:rPr>
+        <w:t>generation-dependent at fixed size</w:t>
+      </w:r>
+      <w:r>
+        <w:t>. We thus characterize all four challenge axes: reservoir size, encoding density, shot budget, and noise.</w:t>
       </w:r>
     </w:p>
     <w:p>
@@ -2723,7 +2750,7 @@
         <w:t>characterized negative</w:t>
       </w:r>
       <w:r>
-        <w:t xml:space="preserve"> — scale-1 beyond the coherence budget after routing on both days (raw 0.261→0.223 across a replication: day-scale drift exceeds shot noise; regime, not point value, is the robust claim) — while Garnet at n=10 and n=12 landed </w:t>
+        <w:t xml:space="preserve"> — scale-1 beyond the coherence budget after routing on both days (raw 0.261→0.223 across a replication: day-scale drift exceeds shot noise; regime, not point value, is the robust claim) — while Garnet at n=10/n=12 and Emerald at n=8 landed </w:t>
       </w:r>
       <w:r>
         <w:rPr>
@@ -2732,7 +2759,7 @@
         <w:t>inside</w:t>
       </w:r>
       <w:r>
-        <w:t xml:space="preserve"> their limits with the same-session n=8 anchor beyond: the wall is size/instance-dependent, not absolute, with the mechanism unresolved. The trapped-ion run is signal-bearing, but mitigation </w:t>
+        <w:t xml:space="preserve"> their limits with the same-session Garnet n=8 anchor beyond: the wall is size/instance- and generation-dependent, not absolute, with the mechanism unresolved. The trapped-ion run is signal-bearing, but mitigation </w:t>
       </w:r>
       <w:r>
         <w:rPr>

</xml_diff>

<commit_message>
results: Amendment-4 pair - generation effect CONFIRMED temporally controlled; platform finding 3
- same-window split reproduced: Garnet raw 0.2307 beyond limit, Emerald
  0.1690 inside; decision rule branch 1; 0.0617 gap in one window kills
  the day-drift objection; Garnet n=8 now 3 measurements within 0.009
- Garnet pair 3,050 cr org-billed exactly; Emerald pair 3,350 cr was
  SILENTLY billed to the personal account despite org-key submission
  (job fragment -bd52- vs -4500-, 403 under org key) - documented as
  unconfirmed platform finding 3 in platform_feedback_qbraid.md, ledger
  notes in CREDIT_BUDGET (org ledger 60,698.25/65,000, reserve 4,301.75;
  3,350 accounted under self-funded era)
- days-spanning S3 caveat removed from findings and paper; PDF rebuilt,
  5 pages, tofu-free

Co-Authored-By: Claude Fable 5 <noreply@anthropic.com>
Claude-Session: https://claude.ai/code/session_01SH3wHCzTCUP7HwrV3NZtab
</commit_message>
<xml_diff>
--- a/PHASE3_PAPER.docx
+++ b/PHASE3_PAPER.docx
@@ -2707,13 +2707,22 @@
         <w:t>raw 0.179 &lt; 0.196</w:t>
       </w:r>
       <w:r>
-        <w:t xml:space="preserve"> — signal-bearing at the very size Garnet scrambles (S3b refuted high): the wall is also </w:t>
+        <w:t xml:space="preserve"> — signal-bearing at the very size Garnet scrambles (S3b refuted high) — and a pre-registered </w:t>
       </w:r>
       <w:r>
         <w:rPr>
           <w:b/>
         </w:rPr>
-        <w:t>generation-dependent at fixed size</w:t>
+        <w:t>same-window pair</w:t>
+      </w:r>
+      <w:r>
+        <w:t xml:space="preserve"> (both chips on the clock simultaneously) reproduced the split, Emerald 0.169 vs Garnet 0.231: the wall is </w:t>
+      </w:r>
+      <w:r>
+        <w:rPr>
+          <w:b/>
+        </w:rPr>
+        <w:t>generation-dependent at fixed size, temporally controlled</w:t>
       </w:r>
       <w:r>
         <w:t>. We thus characterize all four challenge axes: reservoir size, encoding density, shot budget, and noise.</w:t>

</xml_diff>

<commit_message>
paper: reclaim references page - body now 5 full content pages per rules
- rules exclude references (and cover) from the 5-page limit; references
  moved to their own page 6 via new pagebreak directive in build_paper.py
  (docx + reportlab renderers)
- reclaimed ~half page funds: cross-platform hardware results table
  (device/tech/n/raw/limit/regime, all 10 campaigns in one view) and an
  execution-provenance paragraph (pre-registration mechanics, commit-hash
  job tags, billed-to-estimate audit, purchased controls, S5/S6 outlook)
- older section-6/7 narrative compressed where the table now carries the
  numbers; stale 'deferred to QPU runs' claim fixed (they executed)
- verified: 6 pages total (5 body + references), tofu-free, visually
  checked; checklist updated (cover merge -> 7 pages, references heading
  starts its own page)

Co-Authored-By: Claude Fable 5 <noreply@anthropic.com>
Claude-Session: https://claude.ai/code/session_01SH3wHCzTCUP7HwrV3NZtab
</commit_message>
<xml_diff>
--- a/PHASE3_PAPER.docx
+++ b/PHASE3_PAPER.docx
@@ -2470,15 +2470,6 @@
         <w:rPr>
           <w:rFonts w:ascii="Courier New" w:hAnsi="Courier New"/>
         </w:rPr>
-        <w:t>qbraid_submit.py</w:t>
-      </w:r>
-      <w:r>
-        <w:t xml:space="preserve">, </w:t>
-      </w:r>
-      <w:r>
-        <w:rPr>
-          <w:rFonts w:ascii="Courier New" w:hAnsi="Courier New"/>
-        </w:rPr>
         <w:t>cli.py run qsubmit</w:t>
       </w:r>
       <w:r>
@@ -2491,7 +2482,7 @@
         <w:t>3.9×10⁻¹⁶</w:t>
       </w:r>
       <w:r>
-        <w:t xml:space="preserve"> via the exact circuit (our per-run classical cross-check), (ii) characterizes the </w:t>
+        <w:t xml:space="preserve"> (the per-run classical cross-check), (ii) characterizes the </w:t>
       </w:r>
       <w:r>
         <w:rPr>
@@ -2518,7 +2509,7 @@
         <w:t>Executed on real hardware:</w:t>
       </w:r>
       <w:r>
-        <w:t xml:space="preserve"> the full mitigated protocol ran on </w:t>
+        <w:t xml:space="preserve"> the full mitigated protocol ran first on </w:t>
       </w:r>
       <w:r>
         <w:rPr>
@@ -2527,16 +2518,16 @@
         <w:t>Rigetti Cepheus-1-108q</w:t>
       </w:r>
       <w:r>
-        <w:t xml:space="preserve"> (12 logged cloud jobs; little-endian bit order auto-detected; measured readout errors 2.3%/6.4%): after lattice routing the scale-1 circuit already exceeds the coherence budget (raw feature error 0.261 vs the 0.196 fully-depolarized limit; a 4k-shot replication measured 0.223 — the beyond-limit regime is stable under day-scale drift, ZNE recovering only marginally to 0.217) — measuring on metal exactly the accumulated two-qubit-gate cost §5.4 predicts. The </w:t>
+        <w:t xml:space="preserve"> (12 logged cloud jobs; bit order auto-detected; readout 2.3%/6.4%): after lattice routing, scale-1 already exceeds the coherence budget — the accumulated two-qubit-gate cost §5.4 predicts, measured on metal (ZNE marginal; a 4k-shot replication showed the beyond-limit regime stable under day-scale drift). The pre-registered </w:t>
       </w:r>
       <w:r>
         <w:rPr>
           <w:b/>
         </w:rPr>
-        <w:t>full pre-registered 4k-shot Garnet protocol</w:t>
-      </w:r>
-      <w:r>
-        <w:t xml:space="preserve"> then executed (12 jobs): raw 0.230 — beyond the 0.196 limit and above our routing-free 0.171 forecast (</w:t>
+        <w:t>Garnet protocol</w:t>
+      </w:r>
+      <w:r>
+        <w:t xml:space="preserve"> replicated the regime on a second vendor (raw 0.230 &gt; our routing-free 0.171 forecast — </w:t>
       </w:r>
       <w:r>
         <w:rPr>
@@ -2545,7 +2536,7 @@
         <w:t>prediction (iii) confirmed</w:t>
       </w:r>
       <w:r>
-        <w:t xml:space="preserve">; ZNE recovery non-monotone) — replicating this regime on a second superconducting vendor (readout 0.4%/3.2%). Cross-platform execution also surfaced a </w:t>
+        <w:t xml:space="preserve">). Cross-platform execution also surfaced a </w:t>
       </w:r>
       <w:r>
         <w:rPr>
@@ -2554,25 +2545,16 @@
         <w:t>platform-level finding</w:t>
       </w:r>
       <w:r>
-        <w:t xml:space="preserve">: an RY(π)RY(−π) identity pair executed as </w:t>
+        <w:t xml:space="preserve">: negative-angle rotations are </w:t>
       </w:r>
       <w:r>
         <w:rPr>
           <w:b/>
         </w:rPr>
-        <w:t>net RY(π)</w:t>
-      </w:r>
-      <w:r>
-        <w:t xml:space="preserve"> on the IonQ route — the client-side IonQ JSON provably contained both signed rotations, so negative-angle gates are lost server-side, which would silently corrupt ZNE's negated fold gates. We hardened the emitter (angles mod 2π; diagonal-only |0…0⟩ calibration, exact under </w:t>
-      </w:r>
-      <w:r>
-        <w:rPr>
-          <w:i/>
-        </w:rPr>
-        <w:t>any</w:t>
-      </w:r>
-      <w:r>
-        <w:t xml:space="preserve"> subset of gates executing) and validated the fix on-device: P(|0⁸⟩)=0.996 vs 0.0 pre-fix, with trapped-ion readout ≈0.4%/qubit — the device-class contrast §5.4 anticipates. The decisive routing-free </w:t>
+        <w:t>silently lost server-side on the IonQ route</w:t>
+      </w:r>
+      <w:r>
+        <w:t xml:space="preserve"> (an RY(π)RY(−π) identity pair executed as net RY(π); the client-side JSON provably contained both) — corrupting ZNE's negated fold gates. We hardened the emitter (angles mod 2π; diagonal-only calibrations) and validated on-device: P(|0⁸⟩)=0.996 vs 0.0 pre-fix. The decisive routing-free </w:t>
       </w:r>
       <w:r>
         <w:rPr>
@@ -2581,7 +2563,7 @@
         <w:t>IonQ Forte-1 campaign then executed</w:t>
       </w:r>
       <w:r>
-        <w:t xml:space="preserve"> under the pre-committed manifest: a smoke gate first measured a </w:t>
+        <w:t xml:space="preserve"> under the pre-committed manifest: a smoke gate measured a </w:t>
       </w:r>
       <w:r>
         <w:rPr>
@@ -2590,16 +2572,16 @@
         <w:t>2,000-gate/circuit device ceiling</w:t>
       </w:r>
       <w:r>
-        <w:t xml:space="preserve"> on both access routes (fold-3 = 2,484 gates), so per pre-registered abort rule the campaign ran scale-1-only (5 jobs, 500 shots, readout 0.08%/0.65%). Measured </w:t>
+        <w:t xml:space="preserve"> on both access routes, so per abort rule it ran scale-1-only (500 shots, readout 0.08%/0.65%). </w:t>
       </w:r>
       <w:r>
         <w:rPr>
           <w:b/>
         </w:rPr>
-        <w:t>raw feature error 0.104 — below the 0.196 depolarized limit</w:t>
-      </w:r>
-      <w:r>
-        <w:t xml:space="preserve"> and the superconducting 0.230/0.261: the </w:t>
+        <w:t>Raw 0.104 — below the 0.196 depolarized limit</w:t>
+      </w:r>
+      <w:r>
+        <w:t xml:space="preserve"> and every superconducting n=8 number: the </w:t>
       </w:r>
       <w:r>
         <w:rPr>
@@ -2617,7 +2599,7 @@
         <w:t>prediction (ii) confirmed</w:t>
       </w:r>
       <w:r>
-        <w:t>, under our 0.149 forecast). One pre-registered circuit thus measures the coherence wall from both sides — routed superconducting lattices beyond the limit, the 220-gate all-to-all ion machine inside it (</w:t>
+        <w:t>, under our 0.149 forecast) — one pre-registered circuit measuring the coherence wall from both sides (</w:t>
       </w:r>
       <w:r>
         <w:rPr>
@@ -2644,25 +2626,16 @@
         <w:t>results/qpu_scaling_outlook.md</w:t>
       </w:r>
       <w:r>
-        <w:t xml:space="preserve">) then executed: on Garnet, </w:t>
+        <w:t xml:space="preserve">) then refuted our own statements on metal (table below): Garnet turns </w:t>
       </w:r>
       <w:r>
         <w:rPr>
           <w:b/>
         </w:rPr>
-        <w:t>n=10 raw 0.159 &lt; limit 0.179 and n=12 raw 0.190 &lt; limit 0.214</w:t>
-      </w:r>
-      <w:r>
-        <w:t xml:space="preserve"> — two </w:t>
-      </w:r>
-      <w:r>
-        <w:rPr>
-          <w:b/>
-        </w:rPr>
-        <w:t>signal-bearing superconducting runs</w:t>
-      </w:r>
-      <w:r>
-        <w:t xml:space="preserve">, refuting our own statements S1/S2 — while a </w:t>
+        <w:t>signal-bearing at n=10/n=12</w:t>
+      </w:r>
+      <w:r>
+        <w:t xml:space="preserve"> while a </w:t>
       </w:r>
       <w:r>
         <w:rPr>
@@ -2671,7 +2644,573 @@
         <w:t>same-session n=8 anchor</w:t>
       </w:r>
       <w:r>
-        <w:t xml:space="preserve"> (interleaved jobs, matching calibration fingerprint) measured 0.222 ≥ 0.196: by the decision rule pre-committed in the manifest </w:t>
+        <w:t xml:space="preserve"> stays scrambled — the size effect is </w:t>
+      </w:r>
+      <w:r>
+        <w:rPr>
+          <w:b/>
+        </w:rPr>
+        <w:t>real and drift-controlled</w:t>
+      </w:r>
+      <w:r>
+        <w:t xml:space="preserve"> by the manifest's pre-committed decision rule (mechanism honestly open: instance structure vs lattice embedding) — and the newer-generation </w:t>
+      </w:r>
+      <w:r>
+        <w:rPr>
+          <w:b/>
+        </w:rPr>
+        <w:t>Emerald is signal-bearing at the very size Garnet scrambles</w:t>
+      </w:r>
+      <w:r>
+        <w:t xml:space="preserve">, reproduced in a </w:t>
+      </w:r>
+      <w:r>
+        <w:rPr>
+          <w:b/>
+        </w:rPr>
+        <w:t>same-window two-chip pair</w:t>
+      </w:r>
+      <w:r>
+        <w:t>: generation-dependent at fixed size, temporally controlled. We thus characterize all four challenge axes — reservoir size, encoding density, shot budget, noise — with the program in one view (raw mean feature error vs size-matched fully-depolarized limit; 4k shots, IonQ 500):</w:t>
+      </w:r>
+    </w:p>
+    <w:tbl>
+      <w:tblPr>
+        <w:tblStyle w:val="LightGrid-Accent1"/>
+        <w:tblW w:type="auto" w:w="0"/>
+        <w:tblLook w:firstColumn="1" w:firstRow="1" w:lastColumn="0" w:lastRow="0" w:noHBand="0" w:noVBand="1" w:val="04A0"/>
+      </w:tblPr>
+      <w:tblGrid>
+        <w:gridCol w:w="1680"/>
+        <w:gridCol w:w="1680"/>
+        <w:gridCol w:w="1680"/>
+        <w:gridCol w:w="1680"/>
+        <w:gridCol w:w="1680"/>
+        <w:gridCol w:w="1680"/>
+      </w:tblGrid>
+      <w:tr>
+        <w:tc>
+          <w:tcPr>
+            <w:tcW w:type="dxa" w:w="1680"/>
+          </w:tcPr>
+          <w:p>
+            <w:r>
+              <w:rPr>
+                <w:b/>
+                <w:sz w:val="18"/>
+              </w:rPr>
+              <w:t>device</w:t>
+            </w:r>
+          </w:p>
+        </w:tc>
+        <w:tc>
+          <w:tcPr>
+            <w:tcW w:type="dxa" w:w="1680"/>
+          </w:tcPr>
+          <w:p>
+            <w:r>
+              <w:rPr>
+                <w:b/>
+                <w:sz w:val="18"/>
+              </w:rPr>
+              <w:t>technology</w:t>
+            </w:r>
+          </w:p>
+        </w:tc>
+        <w:tc>
+          <w:tcPr>
+            <w:tcW w:type="dxa" w:w="1680"/>
+          </w:tcPr>
+          <w:p>
+            <w:r>
+              <w:rPr>
+                <w:b/>
+                <w:sz w:val="18"/>
+              </w:rPr>
+              <w:t>n</w:t>
+            </w:r>
+          </w:p>
+        </w:tc>
+        <w:tc>
+          <w:tcPr>
+            <w:tcW w:type="dxa" w:w="1680"/>
+          </w:tcPr>
+          <w:p>
+            <w:r>
+              <w:rPr>
+                <w:b/>
+                <w:sz w:val="18"/>
+              </w:rPr>
+              <w:t>raw error</w:t>
+            </w:r>
+          </w:p>
+        </w:tc>
+        <w:tc>
+          <w:tcPr>
+            <w:tcW w:type="dxa" w:w="1680"/>
+          </w:tcPr>
+          <w:p>
+            <w:r>
+              <w:rPr>
+                <w:b/>
+                <w:sz w:val="18"/>
+              </w:rPr>
+              <w:t>limit</w:t>
+            </w:r>
+          </w:p>
+        </w:tc>
+        <w:tc>
+          <w:tcPr>
+            <w:tcW w:type="dxa" w:w="1680"/>
+          </w:tcPr>
+          <w:p>
+            <w:r>
+              <w:rPr>
+                <w:b/>
+                <w:sz w:val="18"/>
+              </w:rPr>
+              <w:t>regime</w:t>
+            </w:r>
+          </w:p>
+        </w:tc>
+      </w:tr>
+      <w:tr>
+        <w:tc>
+          <w:tcPr>
+            <w:tcW w:type="dxa" w:w="1680"/>
+          </w:tcPr>
+          <w:p>
+            <w:r>
+              <w:rPr>
+                <w:sz w:val="18"/>
+              </w:rPr>
+              <w:t>IonQ Forte-1</w:t>
+            </w:r>
+          </w:p>
+        </w:tc>
+        <w:tc>
+          <w:tcPr>
+            <w:tcW w:type="dxa" w:w="1680"/>
+          </w:tcPr>
+          <w:p>
+            <w:r>
+              <w:rPr>
+                <w:sz w:val="18"/>
+              </w:rPr>
+              <w:t>trapped-ion</w:t>
+            </w:r>
+          </w:p>
+        </w:tc>
+        <w:tc>
+          <w:tcPr>
+            <w:tcW w:type="dxa" w:w="1680"/>
+          </w:tcPr>
+          <w:p>
+            <w:r>
+              <w:rPr>
+                <w:sz w:val="18"/>
+              </w:rPr>
+              <w:t>8</w:t>
+            </w:r>
+          </w:p>
+        </w:tc>
+        <w:tc>
+          <w:tcPr>
+            <w:tcW w:type="dxa" w:w="1680"/>
+          </w:tcPr>
+          <w:p>
+            <w:r>
+              <w:rPr>
+                <w:b/>
+                <w:sz w:val="18"/>
+              </w:rPr>
+              <w:t>0.104</w:t>
+            </w:r>
+          </w:p>
+        </w:tc>
+        <w:tc>
+          <w:tcPr>
+            <w:tcW w:type="dxa" w:w="1680"/>
+          </w:tcPr>
+          <w:p>
+            <w:r>
+              <w:rPr>
+                <w:sz w:val="18"/>
+              </w:rPr>
+              <w:t>0.196</w:t>
+            </w:r>
+          </w:p>
+        </w:tc>
+        <w:tc>
+          <w:tcPr>
+            <w:tcW w:type="dxa" w:w="1680"/>
+          </w:tcPr>
+          <w:p>
+            <w:r>
+              <w:rPr>
+                <w:b/>
+                <w:sz w:val="18"/>
+              </w:rPr>
+              <w:t>signal-bearing</w:t>
+            </w:r>
+            <w:r>
+              <w:rPr>
+                <w:sz w:val="18"/>
+              </w:rPr>
+              <w:t xml:space="preserve"> (prediction (ii) ✓)</w:t>
+            </w:r>
+          </w:p>
+        </w:tc>
+      </w:tr>
+      <w:tr>
+        <w:tc>
+          <w:tcPr>
+            <w:tcW w:type="dxa" w:w="1680"/>
+          </w:tcPr>
+          <w:p>
+            <w:r>
+              <w:rPr>
+                <w:sz w:val="18"/>
+              </w:rPr>
+              <w:t>IQM Emerald</w:t>
+            </w:r>
+          </w:p>
+        </w:tc>
+        <w:tc>
+          <w:tcPr>
+            <w:tcW w:type="dxa" w:w="1680"/>
+          </w:tcPr>
+          <w:p>
+            <w:r>
+              <w:rPr>
+                <w:sz w:val="18"/>
+              </w:rPr>
+              <w:t>supercond., newer gen</w:t>
+            </w:r>
+          </w:p>
+        </w:tc>
+        <w:tc>
+          <w:tcPr>
+            <w:tcW w:type="dxa" w:w="1680"/>
+          </w:tcPr>
+          <w:p>
+            <w:r>
+              <w:rPr>
+                <w:sz w:val="18"/>
+              </w:rPr>
+              <w:t>8</w:t>
+            </w:r>
+          </w:p>
+        </w:tc>
+        <w:tc>
+          <w:tcPr>
+            <w:tcW w:type="dxa" w:w="1680"/>
+          </w:tcPr>
+          <w:p>
+            <w:r>
+              <w:rPr>
+                <w:b/>
+                <w:sz w:val="18"/>
+              </w:rPr>
+              <w:t>0.169–0.179</w:t>
+            </w:r>
+          </w:p>
+        </w:tc>
+        <w:tc>
+          <w:tcPr>
+            <w:tcW w:type="dxa" w:w="1680"/>
+          </w:tcPr>
+          <w:p>
+            <w:r>
+              <w:rPr>
+                <w:sz w:val="18"/>
+              </w:rPr>
+              <w:t>0.196</w:t>
+            </w:r>
+          </w:p>
+        </w:tc>
+        <w:tc>
+          <w:tcPr>
+            <w:tcW w:type="dxa" w:w="1680"/>
+          </w:tcPr>
+          <w:p>
+            <w:r>
+              <w:rPr>
+                <w:b/>
+                <w:sz w:val="18"/>
+              </w:rPr>
+              <w:t>signal-bearing</w:t>
+            </w:r>
+            <w:r>
+              <w:rPr>
+                <w:sz w:val="18"/>
+              </w:rPr>
+              <w:t xml:space="preserve"> (S3b refuted high; same-window pair)</w:t>
+            </w:r>
+          </w:p>
+        </w:tc>
+      </w:tr>
+      <w:tr>
+        <w:tc>
+          <w:tcPr>
+            <w:tcW w:type="dxa" w:w="1680"/>
+          </w:tcPr>
+          <w:p>
+            <w:r>
+              <w:rPr>
+                <w:sz w:val="18"/>
+              </w:rPr>
+              <w:t>IQM Garnet</w:t>
+            </w:r>
+          </w:p>
+        </w:tc>
+        <w:tc>
+          <w:tcPr>
+            <w:tcW w:type="dxa" w:w="1680"/>
+          </w:tcPr>
+          <w:p>
+            <w:r>
+              <w:rPr>
+                <w:sz w:val="18"/>
+              </w:rPr>
+              <w:t>superconducting</w:t>
+            </w:r>
+          </w:p>
+        </w:tc>
+        <w:tc>
+          <w:tcPr>
+            <w:tcW w:type="dxa" w:w="1680"/>
+          </w:tcPr>
+          <w:p>
+            <w:r>
+              <w:rPr>
+                <w:sz w:val="18"/>
+              </w:rPr>
+              <w:t>10 / 12</w:t>
+            </w:r>
+          </w:p>
+        </w:tc>
+        <w:tc>
+          <w:tcPr>
+            <w:tcW w:type="dxa" w:w="1680"/>
+          </w:tcPr>
+          <w:p>
+            <w:r>
+              <w:rPr>
+                <w:b/>
+                <w:sz w:val="18"/>
+              </w:rPr>
+              <w:t>0.159 / 0.190</w:t>
+            </w:r>
+          </w:p>
+        </w:tc>
+        <w:tc>
+          <w:tcPr>
+            <w:tcW w:type="dxa" w:w="1680"/>
+          </w:tcPr>
+          <w:p>
+            <w:r>
+              <w:rPr>
+                <w:sz w:val="18"/>
+              </w:rPr>
+              <w:t>0.179 / 0.214</w:t>
+            </w:r>
+          </w:p>
+        </w:tc>
+        <w:tc>
+          <w:tcPr>
+            <w:tcW w:type="dxa" w:w="1680"/>
+          </w:tcPr>
+          <w:p>
+            <w:r>
+              <w:rPr>
+                <w:b/>
+                <w:sz w:val="18"/>
+              </w:rPr>
+              <w:t>signal-bearing</w:t>
+            </w:r>
+            <w:r>
+              <w:rPr>
+                <w:sz w:val="18"/>
+              </w:rPr>
+              <w:t xml:space="preserve"> (S1/S2 refuted; anchor-controlled)</w:t>
+            </w:r>
+          </w:p>
+        </w:tc>
+      </w:tr>
+      <w:tr>
+        <w:tc>
+          <w:tcPr>
+            <w:tcW w:type="dxa" w:w="1680"/>
+          </w:tcPr>
+          <w:p>
+            <w:r>
+              <w:rPr>
+                <w:sz w:val="18"/>
+              </w:rPr>
+              <w:t>IQM Garnet</w:t>
+            </w:r>
+          </w:p>
+        </w:tc>
+        <w:tc>
+          <w:tcPr>
+            <w:tcW w:type="dxa" w:w="1680"/>
+          </w:tcPr>
+          <w:p>
+            <w:r>
+              <w:rPr>
+                <w:sz w:val="18"/>
+              </w:rPr>
+              <w:t>superconducting</w:t>
+            </w:r>
+          </w:p>
+        </w:tc>
+        <w:tc>
+          <w:tcPr>
+            <w:tcW w:type="dxa" w:w="1680"/>
+          </w:tcPr>
+          <w:p>
+            <w:r>
+              <w:rPr>
+                <w:sz w:val="18"/>
+              </w:rPr>
+              <w:t>8</w:t>
+            </w:r>
+          </w:p>
+        </w:tc>
+        <w:tc>
+          <w:tcPr>
+            <w:tcW w:type="dxa" w:w="1680"/>
+          </w:tcPr>
+          <w:p>
+            <w:r>
+              <w:rPr>
+                <w:sz w:val="18"/>
+              </w:rPr>
+              <w:t>0.222–0.231 (3 days)</w:t>
+            </w:r>
+          </w:p>
+        </w:tc>
+        <w:tc>
+          <w:tcPr>
+            <w:tcW w:type="dxa" w:w="1680"/>
+          </w:tcPr>
+          <w:p>
+            <w:r>
+              <w:rPr>
+                <w:sz w:val="18"/>
+              </w:rPr>
+              <w:t>0.196</w:t>
+            </w:r>
+          </w:p>
+        </w:tc>
+        <w:tc>
+          <w:tcPr>
+            <w:tcW w:type="dxa" w:w="1680"/>
+          </w:tcPr>
+          <w:p>
+            <w:r>
+              <w:rPr>
+                <w:sz w:val="18"/>
+              </w:rPr>
+              <w:t>scrambled — the stable control</w:t>
+            </w:r>
+          </w:p>
+        </w:tc>
+      </w:tr>
+      <w:tr>
+        <w:tc>
+          <w:tcPr>
+            <w:tcW w:type="dxa" w:w="1680"/>
+          </w:tcPr>
+          <w:p>
+            <w:r>
+              <w:rPr>
+                <w:sz w:val="18"/>
+              </w:rPr>
+              <w:t>Rigetti Cepheus-1</w:t>
+            </w:r>
+          </w:p>
+        </w:tc>
+        <w:tc>
+          <w:tcPr>
+            <w:tcW w:type="dxa" w:w="1680"/>
+          </w:tcPr>
+          <w:p>
+            <w:r>
+              <w:rPr>
+                <w:sz w:val="18"/>
+              </w:rPr>
+              <w:t>superconducting</w:t>
+            </w:r>
+          </w:p>
+        </w:tc>
+        <w:tc>
+          <w:tcPr>
+            <w:tcW w:type="dxa" w:w="1680"/>
+          </w:tcPr>
+          <w:p>
+            <w:r>
+              <w:rPr>
+                <w:sz w:val="18"/>
+              </w:rPr>
+              <w:t>8</w:t>
+            </w:r>
+          </w:p>
+        </w:tc>
+        <w:tc>
+          <w:tcPr>
+            <w:tcW w:type="dxa" w:w="1680"/>
+          </w:tcPr>
+          <w:p>
+            <w:r>
+              <w:rPr>
+                <w:sz w:val="18"/>
+              </w:rPr>
+              <w:t>0.223–0.261 (2 days)</w:t>
+            </w:r>
+          </w:p>
+        </w:tc>
+        <w:tc>
+          <w:tcPr>
+            <w:tcW w:type="dxa" w:w="1680"/>
+          </w:tcPr>
+          <w:p>
+            <w:r>
+              <w:rPr>
+                <w:sz w:val="18"/>
+              </w:rPr>
+              <w:t>0.196</w:t>
+            </w:r>
+          </w:p>
+        </w:tc>
+        <w:tc>
+          <w:tcPr>
+            <w:tcW w:type="dxa" w:w="1680"/>
+          </w:tcPr>
+          <w:p>
+            <w:r>
+              <w:rPr>
+                <w:sz w:val="18"/>
+              </w:rPr>
+              <w:t>scrambled (drift band measured)</w:t>
+            </w:r>
+          </w:p>
+        </w:tc>
+      </w:tr>
+    </w:tbl>
+    <w:p>
+      <w:pPr>
+        <w:jc w:val="both"/>
+      </w:pPr>
+      <w:r>
+        <w:rPr>
+          <w:b/>
+        </w:rPr>
+        <w:t>Execution provenance (externally verifiable).</w:t>
+      </w:r>
+      <w:r>
+        <w:t xml:space="preserve"> All ten campaigns were pre-registered in a committed manifest (budgets, abort and decision rules amended </w:t>
       </w:r>
       <w:r>
         <w:rPr>
@@ -2680,52 +3219,16 @@
         <w:t>before</w:t>
       </w:r>
       <w:r>
-        <w:t xml:space="preserve"> execution, the size effect is </w:t>
+        <w:t xml:space="preserve"> each launch); every job embeds the repo commit hash and campaign tag in qBraid's timestamped records — a hash-preimage commitment that predictions predate data — and per-job billing matched estimates to the half-credit (</w:t>
       </w:r>
       <w:r>
         <w:rPr>
-          <w:b/>
+          <w:rFonts w:ascii="Courier New" w:hAnsi="Courier New"/>
         </w:rPr>
-        <w:t>real and drift-controlled</w:t>
-      </w:r>
-      <w:r>
-        <w:t xml:space="preserve">; the mechanism (instance structure vs lattice embedding) is honestly open. Finally, </w:t>
-      </w:r>
-      <w:r>
-        <w:rPr>
-          <w:b/>
-        </w:rPr>
-        <w:t>IQM Emerald</w:t>
-      </w:r>
-      <w:r>
-        <w:t xml:space="preserve"> (54q, newer generation) at n=8 measured </w:t>
-      </w:r>
-      <w:r>
-        <w:rPr>
-          <w:b/>
-        </w:rPr>
-        <w:t>raw 0.179 &lt; 0.196</w:t>
-      </w:r>
-      <w:r>
-        <w:t xml:space="preserve"> — signal-bearing at the very size Garnet scrambles (S3b refuted high) — and a pre-registered </w:t>
-      </w:r>
-      <w:r>
-        <w:rPr>
-          <w:b/>
-        </w:rPr>
-        <w:t>same-window pair</w:t>
-      </w:r>
-      <w:r>
-        <w:t xml:space="preserve"> (both chips on the clock simultaneously) reproduced the split, Emerald 0.169 vs Garnet 0.231: the wall is </w:t>
-      </w:r>
-      <w:r>
-        <w:rPr>
-          <w:b/>
-        </w:rPr>
-        <w:t>generation-dependent at fixed size, temporally controlled</w:t>
-      </w:r>
-      <w:r>
-        <w:t>. We thus characterize all four challenge axes: reservoir size, encoding density, shot budget, and noise.</w:t>
+        <w:t>results/CREDIT_BUDGET.md</w:t>
+      </w:r>
+      <w:r>
+        <w:t>: ≈64k credits; every rejected submission billed 0). Controls were bought exactly where claims needed them: a Rigetti replication (day-drift band), a same-session n=8 anchor (drift excluded from the size effect), a same-window two-chip pair (generation effect temporally controlled). The S5/S6 outlook (hardware-in-the-loop forecasting; hardware-native dissipation) is pre-committed the same way.</w:t>
       </w:r>
     </w:p>
     <w:p>
@@ -2750,7 +3253,7 @@
         <w:t>No quantum advantage</w:t>
       </w:r>
       <w:r>
-        <w:t xml:space="preserve"> is demonstrated at the ≤16-qubit simulable scale; HAR-X (classical, linear) is the best model on this task. (ii) The RV sample ends Feb-2020 (2008 GFC in-sample, 2020 COVID just outside); broader assets/periods are covered only by daily-proxy supporting studies (v2_research: cross-asset, COVID — same negative), not 5-min RV. (iii) Task-level noise is characterized via per-layer single-qubit channels (density-matrix, §5.4) and simulator shot noise (§6); combined noisy-circuit-plus-shot execution is deferred to QPU runs. (iv) g is regularization- and run-configuration-dependent (qualitative gap only). (v) Superconducting execution at n=8 (Rigetti twice + Garnet, §6) is a </w:t>
+        <w:t xml:space="preserve"> is demonstrated at the ≤16-qubit simulable scale; HAR-X (classical, linear) is the best model on this task. (ii) The RV sample ends Feb-2020 (2008 in-sample, COVID just outside); broader assets/periods are daily-proxy supporting studies (v2_research — same negative), not 5-min RV. (iii) Task-level noise: per-layer single-qubit channels (density-matrix, §5.4) and simulator shot noise; combined noisy-plus-shot execution is measured in the QPU campaigns (§6). (iv) g is regularization- and run-configuration-dependent (qualitative gap only). (v) Superconducting n=8 execution is a </w:t>
       </w:r>
       <w:r>
         <w:rPr>
@@ -2759,16 +3262,16 @@
         <w:t>characterized negative</w:t>
       </w:r>
       <w:r>
-        <w:t xml:space="preserve"> — scale-1 beyond the coherence budget after routing on both days (raw 0.261→0.223 across a replication: day-scale drift exceeds shot noise; regime, not point value, is the robust claim) — while Garnet at n=10/n=12 and Emerald at n=8 landed </w:t>
+        <w:t xml:space="preserve"> (§6 table; measured day-scale drift exceeds shot noise, so </w:t>
       </w:r>
       <w:r>
         <w:rPr>
           <w:i/>
         </w:rPr>
-        <w:t>inside</w:t>
-      </w:r>
-      <w:r>
-        <w:t xml:space="preserve"> their limits with the same-session Garnet n=8 anchor beyond: the wall is size/instance- and generation-dependent, not absolute, with the mechanism unresolved. The trapped-ion run is signal-bearing, but mitigation </w:t>
+        <w:t>regime</w:t>
+      </w:r>
+      <w:r>
+        <w:t xml:space="preserve"> — not point value — is the robust claim), while n=10/n=12 and the newer generation land inside their limits: the wall is size/instance- and generation-dependent, not absolute, mechanism unresolved. Mitigation </w:t>
       </w:r>
       <w:r>
         <w:rPr>
@@ -2777,7 +3280,7 @@
         <w:t>recovery</w:t>
       </w:r>
       <w:r>
-        <w:t xml:space="preserve"> on hardware is at best marginal (Richardson 0.223→0.217 on the replicate; the ion chain is flat — readout 0.08%/0.65% leaves nothing to correct, the gate ceiling forbids ZNE). (vi) Distinctness and full-rank entanglement are </w:t>
+        <w:t xml:space="preserve"> on hardware is at best marginal (ZNE 0.223→0.217 on the Rigetti replicate; the ion chain is flat — readout 0.08%/0.65% leaves nothing to correct, the gate ceiling forbids ZNE). (vi) Distinctness and full-rank entanglement are </w:t>
       </w:r>
       <w:r>
         <w:rPr>
@@ -2786,16 +3289,7 @@
         <w:t>necessary, not sufficient</w:t>
       </w:r>
       <w:r>
-        <w:t xml:space="preserve"> — whether they convert beyond the simulable frontier is open. A quantum-data probe (</w:t>
-      </w:r>
-      <w:r>
-        <w:rPr>
-          <w:rFonts w:ascii="Courier New" w:hAnsi="Courier New"/>
-        </w:rPr>
-        <w:t>results/quantum_data_crossover_findings.md</w:t>
-      </w:r>
-      <w:r>
-        <w:t xml:space="preserve">) shows the QRC natively reads nonlinear </w:t>
+        <w:t xml:space="preserve"> — whether they convert beyond the simulable frontier is open. A quantum-data probe shows the QRC natively reads nonlinear </w:t>
       </w:r>
       <w:r>
         <w:rPr>
@@ -2804,7 +3298,7 @@
         <w:t>state</w:t>
       </w:r>
       <w:r>
-        <w:t xml:space="preserve"> functionals (purity, entanglement) a linear readout cannot, but the proper baseline — </w:t>
+        <w:t xml:space="preserve"> functionals (purity, entanglement) a linear readout cannot — but the proper baseline, </w:t>
       </w:r>
       <w:r>
         <w:rPr>
@@ -2813,7 +3307,7 @@
         <w:t>classical shadows</w:t>
       </w:r>
       <w:r>
-        <w:t xml:space="preserve"> (Huang–Kueng–Preskill 2020), now run head-to-head at matched per-state budgets with an ensemble-prior guard — </w:t>
+        <w:t xml:space="preserve"> (Huang–Kueng–Preskill 2020), run head-to-head at matched per-state budgets with an ensemble-prior guard, </w:t>
       </w:r>
       <w:r>
         <w:rPr>
@@ -2822,7 +3316,16 @@
         <w:t>wins wherever real information is extracted</w:t>
       </w:r>
       <w:r>
-        <w:t xml:space="preserve">, including the shadows-hard Tr(ρ³) (nominal QRC "wins" at tiny budgets equal the trivial prior and are discarded; </w:t>
+        <w:t xml:space="preserve">, including the shadows-hard Tr(ρ³): </w:t>
+      </w:r>
+      <w:r>
+        <w:rPr>
+          <w:b/>
+        </w:rPr>
+        <w:t>closed negatively at simulable scale</w:t>
+      </w:r>
+      <w:r>
+        <w:t>; hardware-native many-qubit inputs remain the one untested regime (</w:t>
       </w:r>
       <w:r>
         <w:rPr>
@@ -2831,16 +3334,7 @@
         <w:t>results/shadows_hard_findings.md</w:t>
       </w:r>
       <w:r>
-        <w:t xml:space="preserve">): the quantum-data question is </w:t>
-      </w:r>
-      <w:r>
-        <w:rPr>
-          <w:b/>
-        </w:rPr>
-        <w:t>closed negatively at simulable scale</w:t>
-      </w:r>
-      <w:r>
-        <w:t>; hardware-native many-qubit inputs remain the one untested regime.</w:t>
+        <w:t>).</w:t>
       </w:r>
     </w:p>
     <w:p>
@@ -2856,7 +3350,7 @@
         <w:jc w:val="both"/>
       </w:pPr>
       <w:r>
-        <w:t xml:space="preserve">Volatility forecasts feed hedging, dynamic risk limits and derivatives pricing. We make the impact </w:t>
+        <w:t xml:space="preserve">Volatility forecasts feed hedging, risk limits and derivatives pricing — and we make the impact </w:t>
       </w:r>
       <w:r>
         <w:rPr>
@@ -2883,7 +3377,7 @@
         <w:t>nearly halves the 2008 max drawdown (−61%→−32%)</w:t>
       </w:r>
       <w:r>
-        <w:t xml:space="preserve">, but a </w:t>
+        <w:t xml:space="preserve"> — but a </w:t>
       </w:r>
       <w:r>
         <w:rPr>
@@ -2892,7 +3386,7 @@
         <w:t>plain HAR</w:t>
       </w:r>
       <w:r>
-        <w:t xml:space="preserve"> forecast captures it — rich features and the quantum reservoir add </w:t>
+        <w:t xml:space="preserve"> captures it; the quantum reservoir adds </w:t>
       </w:r>
       <w:r>
         <w:rPr>
@@ -2919,16 +3413,16 @@
         <w:t>Milestone plan:</w:t>
       </w:r>
       <w:r>
-        <w:t xml:space="preserve"> (i)–(v) pre-registration, scaling + encoding sweeps, the adversarial HAR-X/ESN/RFF test, MNIST + noise, and the sparse/TN frontier are ✓; (vi) gate-Trotter QPU validation is </w:t>
+        <w:t xml:space="preserve"> (i)–(v) — pre-registration, scaling/encoding sweeps, the adversarial HAR-X/ESN/RFF test, MNIST + noise, sparse/TN frontier — all ✓; (vi) QPU validation </w:t>
       </w:r>
       <w:r>
         <w:rPr>
           <w:b/>
         </w:rPr>
-        <w:t>executed on real hardware across three vendors</w:t>
-      </w:r>
-      <w:r>
-        <w:t xml:space="preserve"> (Rigetti, IQM, IonQ — §6). </w:t>
+        <w:t>executed on three vendors</w:t>
+      </w:r>
+      <w:r>
+        <w:t xml:space="preserve"> (§6). </w:t>
       </w:r>
       <w:r>
         <w:rPr>
@@ -2938,6 +3432,11 @@
       </w:r>
       <w:r>
         <w:t xml:space="preserve"> Claude (Anthropic) assisted with code and drafting under the team's direction; all decisions and results are the team's own.</w:t>
+      </w:r>
+    </w:p>
+    <w:p>
+      <w:r>
+        <w:br w:type="page"/>
       </w:r>
     </w:p>
     <w:p>

</xml_diff>

<commit_message>
final polish: fix a broken sentence introduced by an earlier trim
"The program characterizes reservoir size, encoding density, shot budget and noise, with
in one view." -- a dangling "with" left when the SNR sentence replaced the original clause.
Now reads: "The program spans reservoir size, encoding density, shot budget and noise; Fig. 3
collects the hardware verdicts."

Found by extracting the .docx body text and cross-reading it against the PDF, which is worth
doing precisely because the two render from the same markdown but expose different defects.

Figure 3 height reduced again to hold 5 body pages + references on p6; re-inspected the render
to confirm all seven bars, value labels, limit ticks and axis labels remain legible.

Verify 5/5 PASS.

Co-Authored-By: Claude Fable 5 <noreply@anthropic.com>
Claude-Session: https://claude.ai/code/session_01SH3wHCzTCUP7HwrV3NZtab
</commit_message>
<xml_diff>
--- a/PHASE3_PAPER.docx
+++ b/PHASE3_PAPER.docx
@@ -2430,7 +2430,7 @@
         <w:t>same-window two-chip pair</w:t>
       </w:r>
       <w:r>
-        <w:t xml:space="preserve">: generation-dependent at fixed size, temporally controlled. The program characterizes reservoir size, encoding density, shot budget and noise, with in one view. The criterion is exactly </w:t>
+        <w:t xml:space="preserve">: generation-dependent at fixed size, temporally controlled. The program spans reservoir size, encoding density, shot budget and noise; Fig. 3 collects the hardware verdicts. The criterion is exactly </w:t>
       </w:r>
       <w:r>
         <w:rPr>
@@ -2448,7 +2448,7 @@
         <w:t>instance</w:t>
       </w:r>
       <w:r>
-        <w:t>-matched (signal magnitude is a property of the circuit, not of n) and the test transfers to any quantum feature map:</w:t>
+        <w:t>-matched (signal magnitude is a circuit property, not an n property) and the test transfers to any quantum feature map:</w:t>
       </w:r>
     </w:p>
     <w:p>
@@ -2458,7 +2458,7 @@
       <w:r>
         <w:drawing>
           <wp:inline xmlns:a="http://schemas.openxmlformats.org/drawingml/2006/main" xmlns:pic="http://schemas.openxmlformats.org/drawingml/2006/picture">
-            <wp:extent cx="5486400" cy="906267"/>
+            <wp:extent cx="5486400" cy="787755"/>
             <wp:docPr id="3" name="Picture 3"/>
             <wp:cNvGraphicFramePr>
               <a:graphicFrameLocks noChangeAspect="1"/>
@@ -2479,7 +2479,7 @@
                   <pic:spPr>
                     <a:xfrm>
                       <a:off x="0" y="0"/>
-                      <a:ext cx="5486400" cy="906267"/>
+                      <a:ext cx="5486400" cy="787755"/>
                     </a:xfrm>
                     <a:prstGeom prst="rect"/>
                   </pic:spPr>
@@ -2536,7 +2536,7 @@
           <w:i/>
           <w:sz w:val="18"/>
         </w:rPr>
-        <w:t xml:space="preserve"> law. Seed-0 limits 0.196/0.179/0.214 at n=8/10/12; seed-1 carries its own 0.1806 — verdict unchanged (§6).</w:t>
+        <w:t xml:space="preserve"> law. Seed-0 limits 0.196/0.179/0.214 at n=8/10/12; seed-1 carries its own 0.1806 (§6).</w:t>
       </w:r>
     </w:p>
     <w:p>
@@ -2867,7 +2867,7 @@
         <w:t>AI disclosure:</w:t>
       </w:r>
       <w:r>
-        <w:t xml:space="preserve"> Claude (Anthropic) assisted with code and drafting; all decisions and results are the team's own.</w:t>
+        <w:t xml:space="preserve"> Claude (Anthropic) assisted with code and drafting; all decisions and results are ours.</w:t>
       </w:r>
     </w:p>
     <w:p>

</xml_diff>

<commit_message>
Paper: humanize the prose; every number, claim and citation preserved
Full-text style revision of PHASE3_PAPER.md for a natural scientific
register: bold runs cut 164 -> 35, formulaic labels removed, sentence
rhythm varied. Verified content-preserving: the multiset of every numeric
token in the document is identical before and after (automated diff), all
section/figure/file cross-references unchanged, References list untouched.
Pagination re-verified: 5 body pages, References alone on page 6, 11-pt
Times, single-spaced. Engine tests 24/24 PASS.

Co-Authored-By: Claude Fable 5 <noreply@anthropic.com>
Claude-Session: https://claude.ai/code/session_01SH3wHCzTCUP7HwrV3NZtab
</commit_message>
<xml_diff>
--- a/PHASE3_PAPER.docx
+++ b/PHASE3_PAPER.docx
@@ -29,25 +29,16 @@
         <w:t>Abstract.</w:t>
       </w:r>
       <w:r>
-        <w:t xml:space="preserve"> We contribute a </w:t>
+        <w:t xml:space="preserve"> We contribute a pre-registered, adversarially controlled </w:t>
       </w:r>
       <w:r>
         <w:rPr>
           <w:b/>
         </w:rPr>
-        <w:t>pre-registered, adversarially-controlled evaluation instrument</w:t>
+        <w:t>evaluation instrument</w:t>
       </w:r>
       <w:r>
-        <w:t xml:space="preserve"> for quantum reservoir computing — reproducible </w:t>
-      </w:r>
-      <w:r>
-        <w:rPr>
-          <w:b/>
-        </w:rPr>
-        <w:t>offline in one command</w:t>
-      </w:r>
-      <w:r>
-        <w:t xml:space="preserve"> (</w:t>
+        <w:t xml:space="preserve"> for quantum reservoir computing and apply it to S&amp;P 500 realized-volatility forecasting on four devices from three QPU vendors (IonQ, IQM, Rigetti). The full audit reruns offline in one command (</w:t>
       </w:r>
       <w:r>
         <w:rPr>
@@ -56,34 +47,7 @@
         <w:t>cli.py verify</w:t>
       </w:r>
       <w:r>
-        <w:t xml:space="preserve">), with every hardware prediction bound to a prior commit by a </w:t>
-      </w:r>
-      <w:r>
-        <w:rPr>
-          <w:b/>
-        </w:rPr>
-        <w:t>hash-preimage commitment</w:t>
-      </w:r>
-      <w:r>
-        <w:t xml:space="preserve"> — and apply it to S&amp;P 500 realized-volatility forecasting across </w:t>
-      </w:r>
-      <w:r>
-        <w:rPr>
-          <w:b/>
-        </w:rPr>
-        <w:t>four devices from three QPU vendors</w:t>
-      </w:r>
-      <w:r>
-        <w:t xml:space="preserve"> (IonQ, IQM, Rigetti). Two measurements stand on their own: an empirical </w:t>
-      </w:r>
-      <w:r>
-        <w:rPr>
-          <w:b/>
-        </w:rPr>
-        <w:t>quantum-complexity metric</w:t>
-      </w:r>
-      <w:r>
-        <w:t xml:space="preserve"> (the reservoir's MPS bond dimension is essentially full, </w:t>
+        <w:t xml:space="preserve">), and every hardware prediction is bound to a prior commit by a hash-preimage commitment. Two measurements stand on their own: an empirical quantum-complexity metric — the reservoir's MPS bond dimension is essentially full, </w:t>
       </w:r>
       <w:r>
         <w:rPr>
@@ -92,7 +56,7 @@
         <w:t>χ_eff ≈ 2^(n/2)</w:t>
       </w:r>
       <w:r>
-        <w:t xml:space="preserve">, marking the classical-simulability boundary) and a cross-platform </w:t>
+        <w:t xml:space="preserve">, at the classical-simulability boundary — and a cross-platform </w:t>
       </w:r>
       <w:r>
         <w:rPr>
@@ -101,16 +65,7 @@
         <w:t>coherence-budget wall</w:t>
       </w:r>
       <w:r>
-        <w:t xml:space="preserve"> (Fig. 3) whose readout-corrected fingerprint separates </w:t>
-      </w:r>
-      <w:r>
-        <w:rPr>
-          <w:b/>
-        </w:rPr>
-        <w:t>coherent circuit routing from depolarizing/damping noise</w:t>
-      </w:r>
-      <w:r>
-        <w:t xml:space="preserve">, each bootstrapped regime verdict </w:t>
+        <w:t xml:space="preserve"> (Fig. 3), whose readout-corrected fingerprint separates coherent circuit routing from depolarizing and damping noise; every bootstrapped regime verdict sits </w:t>
       </w:r>
       <w:r>
         <w:rPr>
@@ -119,16 +74,7 @@
         <w:t>9.7–23.9σ</w:t>
       </w:r>
       <w:r>
-        <w:t xml:space="preserve"> beyond shot noise. Applied honestly, the instrument returns a </w:t>
-      </w:r>
-      <w:r>
-        <w:rPr>
-          <w:b/>
-        </w:rPr>
-        <w:t>well-characterized negative</w:t>
-      </w:r>
-      <w:r>
-        <w:t xml:space="preserve">: at simulable scale (≤16 qubits) the reservoir is </w:t>
+        <w:t xml:space="preserve"> beyond shot noise. Applied to forecasting, the instrument returns a well-characterized negative. At simulable scale (≤16 qubits) the reservoir is </w:t>
       </w:r>
       <w:r>
         <w:rPr>
@@ -137,61 +83,16 @@
         <w:t>distinct but not more accurate</w:t>
       </w:r>
       <w:r>
-        <w:t xml:space="preserve"> than the strongest fair baselines — </w:t>
+        <w:t xml:space="preserve"> than the strongest fair baselines — HAR-X and size-matched ESN/RFF under HAC-DM, Holm and MCS — so </w:t>
       </w:r>
       <w:r>
         <w:rPr>
           <w:b/>
         </w:rPr>
-        <w:t>HAR-X</w:t>
+        <w:t>H0 is refuted</w:t>
       </w:r>
       <w:r>
-        <w:t>, size-matched ESN/RFF, under HAC-DM + Holm + MCS (</w:t>
-      </w:r>
-      <w:r>
-        <w:rPr>
-          <w:b/>
-        </w:rPr>
-        <w:t>H0 refuted</w:t>
-      </w:r>
-      <w:r>
-        <w:t xml:space="preserve">) — robust across a second </w:t>
-      </w:r>
-      <w:r>
-        <w:rPr>
-          <w:b/>
-        </w:rPr>
-        <w:t>Heisenberg</w:t>
-      </w:r>
-      <w:r>
-        <w:t xml:space="preserve"> reservoir family (not Ising-specific) and a second (weather) domain, and our program </w:t>
-      </w:r>
-      <w:r>
-        <w:rPr>
-          <w:b/>
-        </w:rPr>
-        <w:t>falsified four of its own pre-registered predictions</w:t>
-      </w:r>
-      <w:r>
-        <w:t xml:space="preserve"> under controls (a same-session cross-seed control shows the n=8 scrambling is </w:t>
-      </w:r>
-      <w:r>
-        <w:rPr>
-          <w:i/>
-        </w:rPr>
-        <w:t>seed-0-instance-specific, not a size law</w:t>
-      </w:r>
-      <w:r>
-        <w:t xml:space="preserve">). </w:t>
-      </w:r>
-      <w:r>
-        <w:rPr>
-          <w:b/>
-        </w:rPr>
-        <w:t>Desk takeaway:</w:t>
-      </w:r>
-      <w:r>
-        <w:t xml:space="preserve"> vol-timing a simple RV forecast ≈halves the 2008 drawdown; quantum adds no economic value at this scale.</w:t>
+        <w:t>. The finding survives a second reservoir family (Heisenberg — not Ising-specific) and a second domain (weather), and the program falsified four of its own pre-registered predictions under controls; a same-session cross-seed control shows the n=8 scrambling is specific to the seed-0 instance, not a size law. For a trading desk the practical lever turns out to be simpler than quantum hardware: vol-timing a plain RV forecast roughly halves the 2008 drawdown, and quantum adds no economic value at this scale.</w:t>
       </w:r>
     </w:p>
     <w:p>
@@ -216,25 +117,7 @@
         <w:t>Track A: financial volatility</w:t>
       </w:r>
       <w:r>
-        <w:t xml:space="preserve"> — one-step-ahead forecasting of S&amp;P 500 </w:t>
-      </w:r>
-      <w:r>
-        <w:rPr>
-          <w:b/>
-        </w:rPr>
-        <w:t>realized variance (RV)</w:t>
-      </w:r>
-      <w:r>
-        <w:t xml:space="preserve"> and the tracking of volatility </w:t>
-      </w:r>
-      <w:r>
-        <w:rPr>
-          <w:b/>
-        </w:rPr>
-        <w:t>regime transitions</w:t>
-      </w:r>
-      <w:r>
-        <w:t xml:space="preserve">, the domain where JonesTrading's risk, allocation and derivatives pricing live. RV is long-memory, multi-scale, regime-switching and non-Gaussian — the structure reservoir computing exploits. Our central yardsticks are the Echo State Network (ESN, the classical analog of QRC) and the strongest econometric models (HAR — </w:t>
+        <w:t xml:space="preserve"> — one-step-ahead forecasting of S&amp;P 500 realized variance (RV) and the tracking of volatility regime transitions, the domain where JonesTrading's risk, allocation and derivatives pricing live. RV is long-memory, multi-scale, regime-switching and non-Gaussian; this is precisely the structure reservoir computing exploits. Our central yardsticks are the Echo State Network (ESN, the classical analog of QRC) and the strongest econometric models: HAR (</w:t>
       </w:r>
       <w:r>
         <w:rPr>
@@ -243,7 +126,7 @@
         <w:t>Heterogeneous AutoRegressive</w:t>
       </w:r>
       <w:r>
-        <w:t xml:space="preserve">, Corsi 2009 — and, critically for Phase 3, </w:t>
+        <w:t xml:space="preserve">, Corsi 2009) and, critically for Phase 3, </w:t>
       </w:r>
       <w:r>
         <w:rPr>
@@ -252,16 +135,7 @@
         <w:t>HAR-X</w:t>
       </w:r>
       <w:r>
-        <w:t xml:space="preserve">: HAR augmented with the same realized-measure features we feed the quantum reservoir). We also report GARCH/GJR-GARCH, AR(3), persistence, LSTM, and an RFF/RBF kernel, and we implement the challenge's common </w:t>
-      </w:r>
-      <w:r>
-        <w:rPr>
-          <w:b/>
-        </w:rPr>
-        <w:t>MNIST</w:t>
-      </w:r>
-      <w:r>
-        <w:t xml:space="preserve"> benchmark on the identical engine.</w:t>
+        <w:t xml:space="preserve"> — HAR augmented with the same realized-measure features we feed the quantum reservoir. We also report GARCH/GJR-GARCH, AR(3), persistence, LSTM, and an RFF/RBF kernel, and we implement the challenge's common MNIST benchmark on the identical engine.</w:t>
       </w:r>
     </w:p>
     <w:p>
@@ -272,19 +146,10 @@
         <w:rPr>
           <w:b/>
         </w:rPr>
-        <w:t>This paper's honest thesis.</w:t>
+        <w:t>Thesis.</w:t>
       </w:r>
       <w:r>
-        <w:t xml:space="preserve"> We pre-registered H0 and </w:t>
-      </w:r>
-      <w:r>
-        <w:rPr>
-          <w:i/>
-        </w:rPr>
-        <w:t>attacked our own result</w:t>
-      </w:r>
-      <w:r>
-        <w:t xml:space="preserve"> with fair controls: the dominant accuracy lever is </w:t>
+        <w:t xml:space="preserve"> We pre-registered H0 and then attacked our own result with fair controls. The dominant accuracy lever is </w:t>
       </w:r>
       <w:r>
         <w:rPr>
@@ -293,43 +158,16 @@
         <w:t>which features are encoded</w:t>
       </w:r>
       <w:r>
-        <w:t xml:space="preserve">, not quantum nonlinearity. What survives for the reservoir — kernel distinctness, lower seed variance, full-rank entanglement (classical-simulation hardness) — is </w:t>
-      </w:r>
-      <w:r>
-        <w:rPr>
-          <w:i/>
-        </w:rPr>
-        <w:t>necessary, not sufficient</w:t>
-      </w:r>
-      <w:r>
-        <w:t xml:space="preserve"> for advantage. </w:t>
+        <w:t xml:space="preserve">, not quantum nonlinearity. What survives for the reservoir — kernel distinctness, lower seed variance, full-rank entanglement (classical- simulation hardness) — is necessary for advantage but not sufficient. </w:t>
       </w:r>
       <w:r>
         <w:rPr>
           <w:b/>
         </w:rPr>
-        <w:t>Vs. prior work.</w:t>
+        <w:t>Relation to prior work.</w:t>
       </w:r>
       <w:r>
-        <w:t xml:space="preserve"> The closest study (Li et al. 2025/26 — QRC for realized volatility) presents the approach as a competitive, noise-resilient </w:t>
-      </w:r>
-      <w:r>
-        <w:rPr>
-          <w:i/>
-        </w:rPr>
-        <w:t>proof-of-concept</w:t>
-      </w:r>
-      <w:r>
-        <w:t xml:space="preserve">; we add the control-hardened, pre-registered evaluation it omits — the decisive </w:t>
-      </w:r>
-      <w:r>
-        <w:rPr>
-          <w:b/>
-        </w:rPr>
-        <w:t>HAR-X</w:t>
-      </w:r>
-      <w:r>
-        <w:t xml:space="preserve"> control, HAC-DM/Holm/MCS, and explicit capability and per-layer-noise audits — turning an encouraging proof-of-concept into a falsifiable result.</w:t>
+        <w:t xml:space="preserve"> The closest study (Li et al. 2025/26, QRC for realized volatility) presents the approach as a competitive, noise-resilient proof of concept. We add the control-hardened, pre-registered evaluation it omits — the decisive HAR-X control, HAC-DM with Holm and MCS, and explicit capability and per-layer-noise audits — which turns an encouraging proof of concept into a falsifiable result.</w:t>
       </w:r>
     </w:p>
     <w:p>
@@ -363,16 +201,7 @@
         <w:t>|0…0⟩</w:t>
       </w:r>
       <w:r>
-        <w:t xml:space="preserve">; the state evolves under a fixed transverse-field </w:t>
-      </w:r>
-      <w:r>
-        <w:rPr>
-          <w:b/>
-        </w:rPr>
-        <w:t>Ising</w:t>
-      </w:r>
-      <w:r>
-        <w:t xml:space="preserve"> Hamiltonian </w:t>
+        <w:t xml:space="preserve">; the state evolves under a fixed transverse-field Ising Hamiltonian </w:t>
       </w:r>
       <w:r>
         <w:rPr>
@@ -399,16 +228,7 @@
         <w:t>J</w:t>
       </w:r>
       <w:r>
-        <w:t xml:space="preserve"> a </w:t>
-      </w:r>
-      <w:r>
-        <w:rPr>
-          <w:b/>
-        </w:rPr>
-        <w:t>random ≈50%-connected</w:t>
-      </w:r>
-      <w:r>
-        <w:t xml:space="preserve"> graph, </w:t>
+        <w:t xml:space="preserve"> a random ≈50%-connected graph, </w:t>
       </w:r>
       <w:r>
         <w:rPr>
@@ -444,52 +264,7 @@
         <w:t>⟨Z_i⟩,⟨Z_iZ_j⟩</w:t>
       </w:r>
       <w:r>
-        <w:t xml:space="preserve"> form the feature vector. A </w:t>
-      </w:r>
-      <w:r>
-        <w:rPr>
-          <w:b/>
-        </w:rPr>
-        <w:t>ridge head consumes these features concatenated with a linear block of the same inputs (incl. HAR)</w:t>
-      </w:r>
-      <w:r>
-        <w:t xml:space="preserve">, so any reservoir gain is genuine nonlinearity </w:t>
-      </w:r>
-      <w:r>
-        <w:rPr>
-          <w:i/>
-        </w:rPr>
-        <w:t>beyond</w:t>
-      </w:r>
-      <w:r>
-        <w:t xml:space="preserve"> the linear span of identical information. The identical inputs feed the classical controls, isolating quantum-vs-classical. Four mechanisms extend the core (multi-scale τ-bank; RZ measurement feedback; regime-adaptive Ising↔Heisenberg via BOCPD; dissipation-as- feature); Phase 3 adds an </w:t>
-      </w:r>
-      <w:r>
-        <w:rPr>
-          <w:b/>
-        </w:rPr>
-        <w:t>encoding-density / data-re-uploading path</w:t>
-      </w:r>
-      <w:r>
-        <w:t xml:space="preserve"> (§5.2) and a </w:t>
-      </w:r>
-      <w:r>
-        <w:rPr>
-          <w:b/>
-        </w:rPr>
-        <w:t>sparse/tensor backend</w:t>
-      </w:r>
-      <w:r>
-        <w:t xml:space="preserve"> (§5.5). The engine is pure NumPy; an explicit PennyLane circuit reproduces it to ≈3.9×10⁻¹⁶ and compiles, at n=8, to </w:t>
-      </w:r>
-      <w:r>
-        <w:rPr>
-          <w:b/>
-        </w:rPr>
-        <w:t>380 native gates</w:t>
-      </w:r>
-      <w:r>
-        <w:t xml:space="preserve"> (220 two-qubit + 160 one-qubit, 20 Trotter layers) — consistent with the ≈50%-connected graph.</w:t>
+        <w:t xml:space="preserve"> form the feature vector. A ridge head consumes these features concatenated with a linear block of the same inputs (including HAR), so any reservoir gain must be genuine nonlinearity beyond the linear span of identical information. The same inputs feed the classical controls, isolating quantum from classical. Four mechanisms extend the core (multi-scale τ-bank; RZ measurement feedback; regime-adaptive Ising↔Heisenberg via BOCPD; dissipation-as-feature); Phase 3 adds an encoding-density / data-re-uploading path (§5.2) and a sparse/tensor backend (§5.5). The engine is pure NumPy; an explicit PennyLane circuit reproduces it to ≈3.9×10⁻¹⁶ and compiles, at n=8, to 380 native gates (220 two-qubit + 160 one-qubit, 20 Trotter layers), consistent with the ≈50%-connected graph.</w:t>
       </w:r>
     </w:p>
     <w:p>
@@ -564,34 +339,7 @@
         <w:jc w:val="both"/>
       </w:pPr>
       <w:r>
-        <w:t xml:space="preserve">The exploited quantum resources map to RV's structure: (a) </w:t>
-      </w:r>
-      <w:r>
-        <w:rPr>
-          <w:b/>
-        </w:rPr>
-        <w:t>Hilbert-space dimensionality</w:t>
-      </w:r>
-      <w:r>
-        <w:t xml:space="preserve"> — n qubits give 2ⁿ amplitudes and O(n²) measured Pauli features at O(n²) parameter cost; (b) </w:t>
-      </w:r>
-      <w:r>
-        <w:rPr>
-          <w:b/>
-        </w:rPr>
-        <w:t>intrinsic nonlinearity</w:t>
-      </w:r>
-      <w:r>
-        <w:t xml:space="preserve"> from fixed unitary evolution (no gradient training, no barren plateaus); (c) </w:t>
-      </w:r>
-      <w:r>
-        <w:rPr>
-          <w:b/>
-        </w:rPr>
-        <w:t>delay-embedded memory</w:t>
-      </w:r>
-      <w:r>
-        <w:t xml:space="preserve"> (the headline model's memory is its explicit lag window, not reservoir recurrence — a recurrent variant is probed in </w:t>
+        <w:t xml:space="preserve">The quantum resources we exploit map onto RV's structure: (a) Hilbert-space dimensionality — n qubits give 2ⁿ amplitudes and O(n²) measured Pauli features at O(n²) parameter cost; (b) intrinsic nonlinearity from fixed unitary evolution, with no gradient training and no barren plateaus; (c) delay-embedded memory (the headline model's memory is its explicit lag window, not reservoir recurrence — a recurrent variant is probed in </w:t>
       </w:r>
       <w:r>
         <w:rPr>
@@ -600,34 +348,7 @@
         <w:t>v3_research</w:t>
       </w:r>
       <w:r>
-        <w:t xml:space="preserve">); (d) </w:t>
-      </w:r>
-      <w:r>
-        <w:rPr>
-          <w:b/>
-        </w:rPr>
-        <w:t>Hamiltonian as inductive bias</w:t>
-      </w:r>
-      <w:r>
-        <w:t xml:space="preserve">. The central, falsifiable mechanism is </w:t>
-      </w:r>
-      <w:r>
-        <w:rPr>
-          <w:b/>
-        </w:rPr>
-        <w:t>expressivity scaling</w:t>
-      </w:r>
-      <w:r>
-        <w:t xml:space="preserve">, which we measure directly via the geometric difference (Huang et al. 2021). The quantum kernel is poorly reproducible by a matched classical reservoir: </w:t>
-      </w:r>
-      <w:r>
-        <w:rPr>
-          <w:b/>
-        </w:rPr>
-        <w:t>g(ESN→CHIMERA) ≈ 64 vs ≈3.7 control</w:t>
-      </w:r>
-      <w:r>
-        <w:t xml:space="preserve"> (</w:t>
+        <w:t>); (d) the Hamiltonian as inductive bias. The central falsifiable mechanism is expressivity scaling, which we measure directly via the geometric difference (Huang et al. 2021). The quantum kernel is poorly reproducible by a matched classical reservoir: g(ESN→CHIMERA) ≈ 64 versus ≈3.7 for the control (</w:t>
       </w:r>
       <w:r>
         <w:rPr>
@@ -636,97 +357,16 @@
         <w:t>cli.py run kernel</w:t>
       </w:r>
       <w:r>
-        <w:t xml:space="preserve">); against per-n </w:t>
-      </w:r>
-      <w:r>
-        <w:rPr>
-          <w:i/>
-        </w:rPr>
-        <w:t>feature-matched</w:t>
-      </w:r>
-      <w:r>
-        <w:t xml:space="preserve"> ESNs it is larger but </w:t>
+        <w:t xml:space="preserve">); against per-n feature-matched ESNs it is larger but non-monotonic (≈125/158/88 at n=8/10/12, fixed ridge — the qualitative separation, not the value, is the claim). At ≤12–16 qubits the map stays classically simulable, so distinctness is necessary but not sufficient — and we measured exactly that: over 30 seeded n=8 instances, per-instance entanglement shows no detectable correlation with forecast error (r=−0.19, p=0.32), and </w:t>
       </w:r>
       <w:r>
         <w:rPr>
           <w:b/>
         </w:rPr>
-        <w:t>non-monotonic</w:t>
+        <w:t>0/30 instances beat HAR-X</w:t>
       </w:r>
       <w:r>
-        <w:t xml:space="preserve"> (≈125/158/88 at n=8/10/12; fixed ridge — the qualitative separation, not the value, is the claim). At ≤12–16 qubits the map stays classically simulable, so distinctness is </w:t>
-      </w:r>
-      <w:r>
-        <w:rPr>
-          <w:b/>
-        </w:rPr>
-        <w:t>necessary, not sufficient</w:t>
-      </w:r>
-      <w:r>
-        <w:t xml:space="preserve"> — which we now </w:t>
-      </w:r>
-      <w:r>
-        <w:rPr>
-          <w:i/>
-        </w:rPr>
-        <w:t>measure</w:t>
-      </w:r>
-      <w:r>
-        <w:t xml:space="preserve">: over </w:t>
-      </w:r>
-      <w:r>
-        <w:rPr>
-          <w:b/>
-        </w:rPr>
-        <w:t>30 seeded n=8 instances</w:t>
-      </w:r>
-      <w:r>
-        <w:t xml:space="preserve">, per-instance entanglement shows </w:t>
-      </w:r>
-      <w:r>
-        <w:rPr>
-          <w:b/>
-        </w:rPr>
-        <w:t>no detectable correlation</w:t>
-      </w:r>
-      <w:r>
-        <w:t xml:space="preserve"> with forecast error (r=−0.19, p=0.32) and </w:t>
-      </w:r>
-      <w:r>
-        <w:rPr>
-          <w:b/>
-        </w:rPr>
-        <w:t>0/30 beat HAR-X</w:t>
-      </w:r>
-      <w:r>
-        <w:t xml:space="preserve"> on crisis </w:t>
-      </w:r>
-      <w:r>
-        <w:rPr>
-          <w:i/>
-        </w:rPr>
-        <w:t>and</w:t>
-      </w:r>
-      <w:r>
-        <w:t xml:space="preserve"> calm (bounding the beat-rate at ≤9.5%, exact one-sided 95%). Nor does instance quality detectably </w:t>
-      </w:r>
-      <w:r>
-        <w:rPr>
-          <w:b/>
-        </w:rPr>
-        <w:t>transfer</w:t>
-      </w:r>
-      <w:r>
-        <w:t xml:space="preserve"> — crisis/calm rankings are unrelated (Spearman +0.01) — so best-of-N seed selection is selection on noise. These detect only |r|≳0.5, so we exclude </w:t>
-      </w:r>
-      <w:r>
-        <w:rPr>
-          <w:i/>
-        </w:rPr>
-        <w:t>strong</w:t>
-      </w:r>
-      <w:r>
-        <w:t xml:space="preserve"> links, not weak ones (</w:t>
+        <w:t xml:space="preserve"> on both crisis and calm windows (bounding the beat-rate at ≤9.5%, exact one-sided 95%). Nor does instance quality detectably transfer — crisis and calm rankings are unrelated (Spearman +0.01) — so best-of-N seed selection is selection on noise. These tests detect only |r|≳0.5, so they exclude strong links, not weak ones (</w:t>
       </w:r>
       <w:r>
         <w:rPr>
@@ -766,7 +406,7 @@
         <w:t>.SPX</w:t>
       </w:r>
       <w:r>
-        <w:t xml:space="preserve"> 5-minute realized variance, 2000–2020, 5,029 supervised days incl. the 2008 GFC (Heber et al. 2009; via R packages </w:t>
+        <w:t xml:space="preserve"> 5-minute realized variance, 2000–2020, 5,029 supervised days including the 2008 GFC (Heber et al. 2009; via R packages </w:t>
       </w:r>
       <w:r>
         <w:rPr>
@@ -799,19 +439,10 @@
         <w:rPr>
           <w:b/>
         </w:rPr>
-        <w:t>Preprocessing:</w:t>
+        <w:t>Preprocessing.</w:t>
       </w:r>
       <w:r>
-        <w:t xml:space="preserve"> log-RV target; features min-max scaled to [0,1] on </w:t>
-      </w:r>
-      <w:r>
-        <w:rPr>
-          <w:b/>
-        </w:rPr>
-        <w:t>train only</w:t>
-      </w:r>
-      <w:r>
-        <w:t xml:space="preserve">; per-model ridge penalty selected on a chronological validation tail; multi-seed ensembling. We verified the pipeline is leakage-free (all features lagged ≥1 day; train-only scaling). </w:t>
+        <w:t xml:space="preserve"> Log-RV target; features min-max scaled to [0,1] on train only; per-model ridge penalty selected on a chronological validation tail; multi-seed ensembling. We verified the pipeline is leakage-free (all features lagged ≥1 day; train-only scaling). </w:t>
       </w:r>
       <w:r>
         <w:rPr>
@@ -820,16 +451,7 @@
         <w:t>Baselines:</w:t>
       </w:r>
       <w:r>
-        <w:t xml:space="preserve"> HAR, </w:t>
-      </w:r>
-      <w:r>
-        <w:rPr>
-          <w:b/>
-        </w:rPr>
-        <w:t>HAR-X</w:t>
-      </w:r>
-      <w:r>
-        <w:t xml:space="preserve">, GARCH(1,1), GJR-GARCH, AR(3), persistence, ESN (matched + 4×, recurrent), RFF kernel, LSTM. </w:t>
+        <w:t xml:space="preserve"> HAR, HAR-X, GARCH(1,1), GJR-GARCH, AR(3), persistence, ESN (matched, 4×, and recurrent), RFF kernel, LSTM. </w:t>
       </w:r>
       <w:r>
         <w:rPr>
@@ -838,43 +460,7 @@
         <w:t>Metrics:</w:t>
       </w:r>
       <w:r>
-        <w:t xml:space="preserve"> RMSE(log-RV), QLIKE (Patton 2011), Mincer–Zarnowitz R²; significance by </w:t>
-      </w:r>
-      <w:r>
-        <w:rPr>
-          <w:b/>
-        </w:rPr>
-        <w:t>Diebold–Mariano with a Newey–West HAC variance</w:t>
-      </w:r>
-      <w:r>
-        <w:t xml:space="preserve"> (HLN-corrected), </w:t>
-      </w:r>
-      <w:r>
-        <w:rPr>
-          <w:b/>
-        </w:rPr>
-        <w:t>Holm</w:t>
-      </w:r>
-      <w:r>
-        <w:t xml:space="preserve">-adjusted across the comparison family, and the Model Confidence Set (Hansen–Lunde–Nason 2011). Holm/MCS are scoped to this </w:t>
-      </w:r>
-      <w:r>
-        <w:rPr>
-          <w:b/>
-        </w:rPr>
-        <w:t>pre-registered</w:t>
-      </w:r>
-      <w:r>
-        <w:t xml:space="preserve"> family; §3/§8 correlations are exploratory, </w:t>
-      </w:r>
-      <w:r>
-        <w:rPr>
-          <w:b/>
-        </w:rPr>
-        <w:t>uncorrected</w:t>
-      </w:r>
-      <w:r>
-        <w:t>, and none survives Holm.</w:t>
+        <w:t xml:space="preserve"> RMSE(log-RV), QLIKE (Patton 2011), Mincer–Zarnowitz R²; significance by Diebold–Mariano with a Newey–West HAC variance (HLN-corrected), Holm-adjusted across the comparison family, plus the Model Confidence Set (Hansen–Lunde–Nason 2011). Holm and MCS are scoped to this pre-registered family; the §3/§8 correlations are exploratory, uncorrected, and none survives Holm.</w:t>
       </w:r>
     </w:p>
     <w:p>
@@ -893,10 +479,10 @@
         <w:rPr>
           <w:b/>
         </w:rPr>
-        <w:t>Pre-registration (honesty).</w:t>
+        <w:t>Pre-registration.</w:t>
       </w:r>
       <w:r>
-        <w:t xml:space="preserve"> Before running, we fixed the confirm/refute thresholds in </w:t>
+        <w:t xml:space="preserve"> Before running anything, we fixed the confirm/refute thresholds in </w:t>
       </w:r>
       <w:r>
         <w:rPr>
@@ -905,7 +491,7 @@
         <w:t>preregistration.py</w:t>
       </w:r>
       <w:r>
-        <w:t xml:space="preserve"> (H0/H1/H4, from our Phase-2 §7). All outcomes — including negatives — are reported against them. Full numbers/wall-clock: </w:t>
+        <w:t xml:space="preserve"> (H0/H1/H4, from our Phase-2 §7). All outcomes, including the negatives, are reported against those thresholds. Full numbers and wall-clock times: </w:t>
       </w:r>
       <w:r>
         <w:rPr>
@@ -928,43 +514,7 @@
         <w:t>5.1 The input-bottleneck mechanism (pre-registered negative).</w:t>
       </w:r>
       <w:r>
-        <w:t xml:space="preserve"> With a </w:t>
-      </w:r>
-      <w:r>
-        <w:rPr>
-          <w:i/>
-        </w:rPr>
-        <w:t>fixed</w:t>
-      </w:r>
-      <w:r>
-        <w:t xml:space="preserve"> univariate 8-lag encoder, extra qubits receive no new input: g(n) and effective feature-rank </w:t>
-      </w:r>
-      <w:r>
-        <w:rPr>
-          <w:b/>
-        </w:rPr>
-        <w:t>saturate/decline</w:t>
-      </w:r>
-      <w:r>
-        <w:t xml:space="preserve"> (n=8→12: g 133→30 at N_sub=800; D_eff 1.8→1.5). </w:t>
-      </w:r>
-      <w:r>
-        <w:rPr>
-          <w:b/>
-        </w:rPr>
-        <w:t>H0 is refuted in this regime</w:t>
-      </w:r>
-      <w:r>
-        <w:t xml:space="preserve"> — the empirical case </w:t>
-      </w:r>
-      <w:r>
-        <w:rPr>
-          <w:i/>
-        </w:rPr>
-        <w:t>for</w:t>
-      </w:r>
-      <w:r>
-        <w:t xml:space="preserve"> enriching the encoding.</w:t>
+        <w:t xml:space="preserve"> With a fixed univariate 8-lag encoder, extra qubits receive no new input, and both g(n) and effective feature-rank saturate or decline (n=8→12: g 133→30 at N_sub=800; D_eff 1.8→1.5). H0 is refuted in this regime — which is itself the empirical case for enriching the encoding.</w:t>
       </w:r>
     </w:p>
     <w:p>
@@ -978,34 +528,7 @@
         <w:t>5.2 Encoding density (Axis B) — mechanism confirmed.</w:t>
       </w:r>
       <w:r>
-        <w:t xml:space="preserve"> Feeding the extra qubits genuinely new realized-measure information (signed return/leverage, downside-semivariance share, jump share) restores the lost structure: at n=10, informed vs idle qubits, kernel distinctness and rank jump (</w:t>
-      </w:r>
-      <w:r>
-        <w:rPr>
-          <w:b/>
-        </w:rPr>
-        <w:t>g 52→158, D_eff 1.5→3.1</w:t>
-      </w:r>
-      <w:r>
-        <w:t xml:space="preserve">), and effective rank grows with n (D_eff 1.81→3.14, n=8→12). So the bottleneck is </w:t>
-      </w:r>
-      <w:r>
-        <w:rPr>
-          <w:i/>
-        </w:rPr>
-        <w:t>fixable</w:t>
-      </w:r>
-      <w:r>
-        <w:t xml:space="preserve"> — added qubits can carry new information. The decisive question is whether this converts into forecasting </w:t>
-      </w:r>
-      <w:r>
-        <w:rPr>
-          <w:b/>
-        </w:rPr>
-        <w:t>accuracy</w:t>
-      </w:r>
-      <w:r>
-        <w:t>.</w:t>
+        <w:t xml:space="preserve"> Feeding the extra qubits genuinely new realized-measure information (signed return/leverage, downside-semivariance share, jump share) restores the lost structure: at n=10, informed versus idle qubits, kernel distinctness and rank jump (g 52→158, D_eff 1.5→3.1), and effective rank grows with n (D_eff 1.81→3.14, n=8→12). The bottleneck is therefore fixable; added qubits can carry new information. The decisive question is whether this converts into forecasting accuracy.</w:t>
       </w:r>
     </w:p>
     <w:p>
@@ -1016,64 +539,10 @@
         <w:rPr>
           <w:b/>
         </w:rPr>
-        <w:t>5.3 The decisive, adversarially-controlled test (the honest headline).</w:t>
+        <w:t>5.3 The decisive, adversarially controlled test.</w:t>
       </w:r>
       <w:r>
-        <w:t xml:space="preserve"> We compare CHIMERA to the strongest fair baselines — </w:t>
-      </w:r>
-      <w:r>
-        <w:rPr>
-          <w:b/>
-        </w:rPr>
-        <w:t>HAR-X</w:t>
-      </w:r>
-      <w:r>
-        <w:t xml:space="preserve"> (the same rich features used </w:t>
-      </w:r>
-      <w:r>
-        <w:rPr>
-          <w:i/>
-        </w:rPr>
-        <w:t>linearly</w:t>
-      </w:r>
-      <w:r>
-        <w:t xml:space="preserve">, no reservoir), a </w:t>
-      </w:r>
-      <w:r>
-        <w:rPr>
-          <w:b/>
-        </w:rPr>
-        <w:t>true recurrent ESN</w:t>
-      </w:r>
-      <w:r>
-        <w:t xml:space="preserve">, and an </w:t>
-      </w:r>
-      <w:r>
-        <w:rPr>
-          <w:b/>
-        </w:rPr>
-        <w:t>RFF kernel</w:t>
-      </w:r>
-      <w:r>
-        <w:t xml:space="preserve"> — all sharing the identical information set and </w:t>
-      </w:r>
-      <w:r>
-        <w:rPr>
-          <w:i/>
-        </w:rPr>
-        <w:t>nesting</w:t>
-      </w:r>
-      <w:r>
-        <w:t xml:space="preserve"> HAR-X, so a quantum win requires nonlinearity beyond the linear span. With </w:t>
-      </w:r>
-      <w:r>
-        <w:rPr>
-          <w:b/>
-        </w:rPr>
-        <w:t>8 seeds, HAC-DM, two windows, and Holm correction</w:t>
-      </w:r>
-      <w:r>
-        <w:t xml:space="preserve"> (</w:t>
+        <w:t xml:space="preserve"> We compare CHIMERA against the strongest fair baselines — HAR-X (the same rich features used linearly, no reservoir), a true recurrent ESN, and an RFF kernel — all sharing the identical information set and nesting HAR-X, so a quantum win requires nonlinearity beyond the linear span. With 8 seeds, HAC-DM, two windows, and Holm correction (</w:t>
       </w:r>
       <w:r>
         <w:rPr>
@@ -1521,106 +990,16 @@
         <w:t>(plain HAR for reference: crisis 0.6290, calm 0.6454 — HAR-X's rich features cut RMSE sharply.)</w:t>
       </w:r>
       <w:r>
-        <w:t xml:space="preserve"> </w:t>
+        <w:t xml:space="preserve"> HAR-X is best or co-best everywhere; CHIMERA never beats it and is indistinguishable from the classical ESN/RFF after Holm (one raw loss to RFF at crisis n=8, p=0.049). After Holm correction no comparison is significant in either direction, and the 95% MCS retains all four models (n=10) — a statistical tie. The earlier "beats HAR" result was an artifact of a feature-poor HAR: the gain came from the encoded realized measures (a known SHAR/HARQ effect), not from quantum nonlinearity. </w:t>
       </w:r>
       <w:r>
         <w:rPr>
           <w:b/>
         </w:rPr>
-        <w:t>HAR-X is best or co-best everywhere; CHIMERA never beats it</w:t>
+        <w:t>By our pre-registered criteria, H0 is refuted, and we report this negative.</w:t>
       </w:r>
       <w:r>
-        <w:t xml:space="preserve"> and is indistinguishable from the classical ESN/RFF after Holm (one raw loss to RFF at crisis n=8, p=0.049). </w:t>
-      </w:r>
-      <w:r>
-        <w:rPr>
-          <w:b/>
-        </w:rPr>
-        <w:t>After Holm correction no comparison is significant in either direction, and the 95% MCS retains all four models (n=10)</w:t>
-      </w:r>
-      <w:r>
-        <w:t xml:space="preserve"> — a statistical tie. The earlier "beats HAR" result was an artifact of a </w:t>
-      </w:r>
-      <w:r>
-        <w:rPr>
-          <w:i/>
-        </w:rPr>
-        <w:t>feature-poor</w:t>
-      </w:r>
-      <w:r>
-        <w:t xml:space="preserve"> HAR: the gain is the encoded realized measures (a known SHAR/HARQ effect), not quantum nonlinearity. </w:t>
-      </w:r>
-      <w:r>
-        <w:rPr>
-          <w:b/>
-        </w:rPr>
-        <w:t>By our pre-registered criteria, H0 is refuted — we report this negative.</w:t>
-      </w:r>
-      <w:r>
-        <w:t xml:space="preserve"> What honestly survives for the quantum reservoir: it is </w:t>
-      </w:r>
-      <w:r>
-        <w:rPr>
-          <w:b/>
-        </w:rPr>
-        <w:t>competitive</w:t>
-      </w:r>
-      <w:r>
-        <w:t xml:space="preserve"> (within ≈0.8–2.1% RMSE of the best at every n), with </w:t>
-      </w:r>
-      <w:r>
-        <w:rPr>
-          <w:b/>
-        </w:rPr>
-        <w:t>lower per-seed dispersion than the recurrent ESN in 3 of 4 cells</w:t>
-      </w:r>
-      <w:r>
-        <w:t xml:space="preserve"> (n=12: 0.009 vs 0.015) and </w:t>
-      </w:r>
-      <w:r>
-        <w:rPr>
-          <w:b/>
-        </w:rPr>
-        <w:t>beats it on the calm window</w:t>
-      </w:r>
-      <w:r>
-        <w:t xml:space="preserve"> (raw p=0.018; n.s. after Holm). A </w:t>
-      </w:r>
-      <w:r>
-        <w:rPr>
-          <w:b/>
-        </w:rPr>
-        <w:t>tuned, size-unconstrained ESN</w:t>
-      </w:r>
-      <w:r>
-        <w:t xml:space="preserve"> (45-config search to 800 nodes) confirms the control was not crippled (0.6020 vs CHIMERA 0.6094, within noise of HAR-X); and </w:t>
-      </w:r>
-      <w:r>
-        <w:rPr>
-          <w:b/>
-        </w:rPr>
-        <w:t>named canonical models</w:t>
-      </w:r>
-      <w:r>
-        <w:t xml:space="preserve"> (SHAR, HAR-CJ, HARQ, HEAVY-RM; MSE + QLIKE DM) — </w:t>
-      </w:r>
-      <w:r>
-        <w:rPr>
-          <w:b/>
-        </w:rPr>
-        <w:t>none beats HAR-X</w:t>
-      </w:r>
-      <w:r>
-        <w:t xml:space="preserve">, with CHIMERA tying best on RMSE and only a </w:t>
-      </w:r>
-      <w:r>
-        <w:rPr>
-          <w:i/>
-        </w:rPr>
-        <w:t>raw, non-Holm</w:t>
-      </w:r>
-      <w:r>
-        <w:t xml:space="preserve"> QLIKE/MZ edge (</w:t>
+        <w:t xml:space="preserve"> What does survive for the quantum reservoir: it is competitive (within ≈0.8–2.1% RMSE of the best at every n), it shows lower per-seed dispersion than the recurrent ESN in 3 of 4 cells (n=12: 0.009 vs 0.015), and it beats the ESN on the calm window (raw p=0.018; not significant after Holm). A tuned, size-unconstrained ESN (45-config search to 800 nodes) confirms the control was not crippled (0.6020 vs CHIMERA 0.6094, within noise of HAR-X). Named canonical models (SHAR, HAR-CJ, HARQ, HEAVY-RM; MSE and QLIKE DM): none beats HAR-X, with CHIMERA tying best on RMSE and holding only a raw, non-Holm QLIKE/MZ edge (</w:t>
       </w:r>
       <w:r>
         <w:rPr>
@@ -1708,127 +1087,28 @@
         <w:rPr>
           <w:b/>
         </w:rPr>
-        <w:t>5.4 Common MNIST benchmark + noise.</w:t>
+        <w:t>5.4 Common MNIST benchmark and noise.</w:t>
       </w:r>
       <w:r>
-        <w:t xml:space="preserve"> Same engine, pixels→PCA(n)→n qubits→Pauli readout→ridge. Accuracy </w:t>
+        <w:t xml:space="preserve"> Same engine: pixels→PCA(n)→n qubits→Pauli readout→ridge. Accuracy scales with qubits (n=5/8/10/12: 0.632/0.798/0.831/0.859, 3 seeds; n=15 sparse-exact continues the trend, 0.878 vs 0.852 for a paired n=12 on a matched subset, closing the brief's 5/10/15 example) and beats the linear-PCA baseline at every n — real nonlinear lift, confirming sufficient expressivity. A matched ESN ties or slightly exceeds CHIMERA (within ≈1% for n≥8; 2.9% at n=5): competitive, not dominant. On noise, the classifier is invariant to depolarizing noise — a uniform Bloch contraction that per-feature standardization removes exactly, with accuracy identical across rates 0.05–0.30 — and robust to amplitude damping (&lt;0.5% at 30%). A converse check (</w:t>
       </w:r>
       <w:r>
         <w:rPr>
-          <w:b/>
+          <w:rFonts w:ascii="Courier New" w:hAnsi="Courier New"/>
         </w:rPr>
-        <w:t>scales with qubits</w:t>
+        <w:t>cli.py run noise_circuit</w:t>
       </w:r>
       <w:r>
-        <w:t xml:space="preserve"> (n=5/8/10/12: 0.632/0.798/0.831/0.859, 3 seeds; </w:t>
-      </w:r>
-      <w:r>
-        <w:rPr>
-          <w:b/>
-        </w:rPr>
-        <w:t>n=15 sparse-exact continues the trend</w:t>
-      </w:r>
-      <w:r>
-        <w:t xml:space="preserve">, 0.878 vs 0.852 for a paired n=12 on a matched subset — closing the brief's 5/10/15 example) and </w:t>
-      </w:r>
-      <w:r>
-        <w:rPr>
-          <w:b/>
-        </w:rPr>
-        <w:t>beats the linear-PCA baseline at every n</w:t>
-      </w:r>
-      <w:r>
-        <w:t xml:space="preserve"> (real nonlinear lift), confirming </w:t>
-      </w:r>
-      <w:r>
-        <w:rPr>
-          <w:b/>
-        </w:rPr>
-        <w:t>sufficient expressivity</w:t>
-      </w:r>
-      <w:r>
-        <w:t xml:space="preserve">; a matched ESN </w:t>
-      </w:r>
-      <w:r>
-        <w:rPr>
-          <w:b/>
-        </w:rPr>
-        <w:t>ties or slightly exceeds</w:t>
-      </w:r>
-      <w:r>
-        <w:t xml:space="preserve"> CHIMERA (within ≈1% for n≥8; 2.9% at n=5) — competitive, not dominant. </w:t>
-      </w:r>
-      <w:r>
-        <w:rPr>
-          <w:b/>
-        </w:rPr>
-        <w:t>Noise:</w:t>
-      </w:r>
-      <w:r>
-        <w:t xml:space="preserve"> the classifier is </w:t>
-      </w:r>
-      <w:r>
-        <w:rPr>
-          <w:b/>
-        </w:rPr>
-        <w:t>invariant to depolarizing</w:t>
-      </w:r>
-      <w:r>
-        <w:t xml:space="preserve"> noise (a uniform Bloch contraction that per-feature standardization removes exactly; accuracy identical across rates 0.05–0.30) and </w:t>
-      </w:r>
-      <w:r>
-        <w:rPr>
-          <w:b/>
-        </w:rPr>
-        <w:t>robust to amplitude damping</w:t>
-      </w:r>
-      <w:r>
-        <w:t xml:space="preserve"> (&lt;0.5% at 30%). </w:t>
-      </w:r>
-      <w:r>
-        <w:rPr>
-          <w:b/>
-        </w:rPr>
-        <w:t>Honesty check (`cli.py run noise_circuit`):</w:t>
-      </w:r>
-      <w:r>
-        <w:t xml:space="preserve"> a per-Trotter-layer density-matrix study shows the </w:t>
+        <w:t xml:space="preserve">) keeps this result in its place: a per-Trotter-layer density-matrix study shows that noise interleaved with the evolution (per-layer single-qubit channels) is </w:t>
       </w:r>
       <w:r>
         <w:rPr>
           <w:i/>
         </w:rPr>
-        <w:t>converse</w:t>
-      </w:r>
-      <w:r>
-        <w:t xml:space="preserve"> — noise interleaved with the evolution (per-layer single-qubit channels) is </w:t>
-      </w:r>
-      <w:r>
-        <w:rPr>
-          <w:b/>
-        </w:rPr>
         <w:t>not</w:t>
       </w:r>
       <w:r>
-        <w:t xml:space="preserve"> removed by standardization (standardized error grows with rate, vs </w:t>
-      </w:r>
-      <w:r>
-        <w:rPr>
-          <w:b/>
-        </w:rPr>
-        <w:t>≈0</w:t>
-      </w:r>
-      <w:r>
-        <w:t xml:space="preserve"> for readout-only depolarizing): the invariance is a </w:t>
-      </w:r>
-      <w:r>
-        <w:rPr>
-          <w:i/>
-        </w:rPr>
-        <w:t>readout</w:t>
-      </w:r>
-      <w:r>
-        <w:t xml:space="preserve"> property, not circuit-level robustness; accumulated gate error is the real NISQ cost (§6).</w:t>
+        <w:t xml:space="preserve"> removed by standardization (standardized error grows with rate, versus ≈0 for readout-only depolarizing). The invariance is a readout property, not circuit-level robustness; accumulated gate error is the real NISQ cost (§6).</w:t>
       </w:r>
     </w:p>
     <w:p>
@@ -1839,7 +1119,7 @@
         <w:rPr>
           <w:b/>
         </w:rPr>
-        <w:t>5.5 Scaling frontier + quantum-complexity metric.</w:t>
+        <w:t>5.5 Scaling frontier and the quantum-complexity metric.</w:t>
       </w:r>
       <w:r>
         <w:t xml:space="preserve"> A sparse-exact backend (</w:t>
@@ -1851,70 +1131,16 @@
         <w:t>expm_multiply</w:t>
       </w:r>
       <w:r>
-        <w:t xml:space="preserve">, no dense propagator; matches the dense engine to </w:t>
+        <w:t xml:space="preserve">, no dense propagator; matches the dense engine to 2.4×10⁻¹⁴) reaches n=16 exactly. For the random ≈50%-connected reservoir we measure the bond dimension χ_eff across a balanced cut: it is essentially full at every n, </w:t>
       </w:r>
       <w:r>
         <w:rPr>
           <w:b/>
         </w:rPr>
-        <w:t>2.4×10⁻¹⁴</w:t>
+        <w:t>χ_eff ≈ 2^(n/2)</w:t>
       </w:r>
       <w:r>
-        <w:t xml:space="preserve">) reaches </w:t>
-      </w:r>
-      <w:r>
-        <w:rPr>
-          <w:b/>
-        </w:rPr>
-        <w:t>n=16 exactly</w:t>
-      </w:r>
-      <w:r>
-        <w:t xml:space="preserve">. For the random ≈50%-connected reservoir we measure the </w:t>
-      </w:r>
-      <w:r>
-        <w:rPr>
-          <w:b/>
-        </w:rPr>
-        <w:t>bond dimension</w:t>
-      </w:r>
-      <w:r>
-        <w:t xml:space="preserve"> χ_eff across a balanced cut: it is </w:t>
-      </w:r>
-      <w:r>
-        <w:rPr>
-          <w:b/>
-        </w:rPr>
-        <w:t>essentially full at every n, χ_eff ≈ 2^(n/2)</w:t>
-      </w:r>
-      <w:r>
-        <w:t xml:space="preserve"> (16→255.9 for n=8→16) — an exact MPS gets </w:t>
-      </w:r>
-      <w:r>
-        <w:rPr>
-          <w:b/>
-        </w:rPr>
-        <w:t>zero compression</w:t>
-      </w:r>
-      <w:r>
-        <w:t xml:space="preserve"> (S ≈ 1.7–3.2 nats): the reservoir admits </w:t>
-      </w:r>
-      <w:r>
-        <w:rPr>
-          <w:b/>
-        </w:rPr>
-        <w:t>no low-bond-dimension (MPS/TEBD) shortcut</w:t>
-      </w:r>
-      <w:r>
-        <w:t xml:space="preserve">, exact cost stays exponential — the precondition any beyond-frontier advantage would need, though none appears at the scale we can test. </w:t>
-      </w:r>
-      <w:r>
-        <w:rPr>
-          <w:b/>
-        </w:rPr>
-        <w:t>Capability + efficiency checks.</w:t>
-      </w:r>
-      <w:r>
-        <w:t xml:space="preserve"> An information-processing-capacity probe (Dambre et al. 2012; </w:t>
+        <w:t xml:space="preserve"> (16→255.9 for n=8→16), and an exact MPS gets zero compression (S ≈ 1.7–3.2 nats). The reservoir admits no low-bond-dimension (MPS/TEBD) shortcut; exact cost stays exponential. That is the precondition any beyond-frontier advantage would need, though none appears at the scale we can test. Capability and efficiency checks agree: an information-processing-capacity probe (Dambre et al. 2012; </w:t>
       </w:r>
       <w:r>
         <w:rPr>
@@ -1923,25 +1149,7 @@
         <w:t>cli.py run capacity</w:t>
       </w:r>
       <w:r>
-        <w:t xml:space="preserve">) finds the quantum reservoir </w:t>
-      </w:r>
-      <w:r>
-        <w:rPr>
-          <w:b/>
-        </w:rPr>
-        <w:t>not more</w:t>
-      </w:r>
-      <w:r>
-        <w:t xml:space="preserve"> — slightly </w:t>
-      </w:r>
-      <w:r>
-        <w:rPr>
-          <w:i/>
-        </w:rPr>
-        <w:t>less</w:t>
-      </w:r>
-      <w:r>
-        <w:t xml:space="preserve"> — nonlinearly expressive than a matched RFF/ESN: no excess expressivity to exploit. A frontier check (</w:t>
+        <w:t>) finds the quantum reservoir not more — in fact slightly less — nonlinearly expressive than a matched RFF/ESN, so there is no excess expressivity to exploit, and a frontier check (</w:t>
       </w:r>
       <w:r>
         <w:rPr>
@@ -1950,52 +1158,7 @@
         <w:t>cli.py run frontier</w:t>
       </w:r>
       <w:r>
-        <w:t xml:space="preserve">) adds that g(n) does </w:t>
-      </w:r>
-      <w:r>
-        <w:rPr>
-          <w:b/>
-        </w:rPr>
-        <w:t>not</w:t>
-      </w:r>
-      <w:r>
-        <w:t xml:space="preserve"> widen toward n=16 (it declines; D_eff/rank grow but a matched ESN keeps pace). </w:t>
-      </w:r>
-      <w:r>
-        <w:rPr>
-          <w:b/>
-        </w:rPr>
-        <w:t>Robustness (supporting study).</w:t>
-      </w:r>
-      <w:r>
-        <w:t xml:space="preserve"> </w:t>
-      </w:r>
-      <w:r>
-        <w:rPr>
-          <w:i/>
-        </w:rPr>
-        <w:t>Second family:</w:t>
-      </w:r>
-      <w:r>
-        <w:t xml:space="preserve"> a </w:t>
-      </w:r>
-      <w:r>
-        <w:rPr>
-          <w:b/>
-        </w:rPr>
-        <w:t>Heisenberg (XXZ)</w:t>
-      </w:r>
-      <w:r>
-        <w:t xml:space="preserve"> reservoir — equally kernel-distinct (g≈55) — also fails to beat HAR-X (0.650 vs 0.642, 8 seeds, full-sample config), so the negative is </w:t>
-      </w:r>
-      <w:r>
-        <w:rPr>
-          <w:b/>
-        </w:rPr>
-        <w:t>not Ising-specific</w:t>
-      </w:r>
-      <w:r>
-        <w:t xml:space="preserve"> (</w:t>
+        <w:t>) shows g(n) does not widen toward n=16 (it declines; D_eff and rank grow but a matched ESN keeps pace). Robustness studies close the loop. Second family: a Heisenberg (XXZ) reservoir, equally kernel-distinct (g≈55), also fails to beat HAR-X (0.650 vs 0.642, 8 seeds, full-sample config), so the negative is not Ising-specific (</w:t>
       </w:r>
       <w:r>
         <w:rPr>
@@ -2004,115 +1167,7 @@
         <w:t>cli.py run second_family</w:t>
       </w:r>
       <w:r>
-        <w:t xml:space="preserve">). </w:t>
-      </w:r>
-      <w:r>
-        <w:rPr>
-          <w:i/>
-        </w:rPr>
-        <w:t>Efficiency:</w:t>
-      </w:r>
-      <w:r>
-        <w:t xml:space="preserve"> with input held fixed, a </w:t>
-      </w:r>
-      <w:r>
-        <w:rPr>
-          <w:i/>
-        </w:rPr>
-        <w:t>smaller</w:t>
-      </w:r>
-      <w:r>
-        <w:t xml:space="preserve"> QRC cannot substitute for a </w:t>
-      </w:r>
-      <w:r>
-        <w:rPr>
-          <w:i/>
-        </w:rPr>
-        <w:t>larger</w:t>
-      </w:r>
-      <w:r>
-        <w:t xml:space="preserve"> classical reservoir — quantum accuracy </w:t>
-      </w:r>
-      <w:r>
-        <w:rPr>
-          <w:b/>
-        </w:rPr>
-        <w:t>saturates</w:t>
-      </w:r>
-      <w:r>
-        <w:t xml:space="preserve"> while the classical curves improve; per feature the static maps are comparable, so the negative is </w:t>
-      </w:r>
-      <w:r>
-        <w:rPr>
-          <w:b/>
-        </w:rPr>
-        <w:t>saturation, not per-feature inferiority</w:t>
-      </w:r>
-      <w:r>
-        <w:t xml:space="preserve"> (weather RMSE °C: CHIMERA 0.85 at its qubit-range ceiling vs RFF 0.78 / recurrent ESN 0.71 at larger budgets). </w:t>
-      </w:r>
-      <w:r>
-        <w:rPr>
-          <w:i/>
-        </w:rPr>
-        <w:t>Domain/architecture:</w:t>
-      </w:r>
-      <w:r>
-        <w:t xml:space="preserve"> the </w:t>
-      </w:r>
-      <w:r>
-        <w:rPr>
-          <w:i/>
-        </w:rPr>
-        <w:t>same</w:t>
-      </w:r>
-      <w:r>
-        <w:t xml:space="preserve"> engine/protocol on chaotic </w:t>
-      </w:r>
-      <w:r>
-        <w:rPr>
-          <w:b/>
-        </w:rPr>
-        <w:t>weather</w:t>
-      </w:r>
-      <w:r>
-        <w:t xml:space="preserve"> (5 stations) and the autonomous </w:t>
-      </w:r>
-      <w:r>
-        <w:rPr>
-          <w:b/>
-        </w:rPr>
-        <w:t>VPT</w:t>
-      </w:r>
-      <w:r>
-        <w:t xml:space="preserve"> metric still show no advantage; the </w:t>
-      </w:r>
-      <w:r>
-        <w:rPr>
-          <w:b/>
-        </w:rPr>
-        <w:t>recurrent</w:t>
-      </w:r>
-      <w:r>
-        <w:t xml:space="preserve"> QRC is competitive-not-better — unitary evolution is non-dissipative, lacking the contraction behind ESN "generalized synchronization" (Ahmed–Tennie–Magri 2025). We then </w:t>
-      </w:r>
-      <w:r>
-        <w:rPr>
-          <w:b/>
-        </w:rPr>
-        <w:t>fixed the mechanism</w:t>
-      </w:r>
-      <w:r>
-        <w:t xml:space="preserve">: engineered memory-qubit damping traces the pre-registered inverted-U, lifting autonomous VPT ≈+60% to </w:t>
-      </w:r>
-      <w:r>
-        <w:rPr>
-          <w:b/>
-        </w:rPr>
-        <w:t>parity</w:t>
-      </w:r>
-      <w:r>
-        <w:t xml:space="preserve"> with the matched ESN — not better (</w:t>
+        <w:t>). Efficiency: with input held fixed, a smaller QRC cannot substitute for a larger classical reservoir — quantum accuracy saturates while the classical curves keep improving; per feature the static maps are comparable, so the negative is saturation, not per-feature inferiority (weather RMSE °C: CHIMERA 0.85 at its qubit-range ceiling vs RFF 0.78 / recurrent ESN 0.71 at larger budgets). Domain and architecture: the same engine and protocol on chaotic weather data (5 stations) and the autonomous VPT metric still show no advantage, and the recurrent QRC is competitive but not better — unitary evolution is non-dissipative, lacking the contraction behind ESN "generalized synchronization" (Ahmed–Tennie–Magri 2025). We then fixed that mechanism: engineered memory-qubit damping traces the pre-registered inverted-U, lifting autonomous VPT by ≈60% to parity with the matched ESN — parity, not advantage (</w:t>
       </w:r>
       <w:r>
         <w:rPr>
@@ -2137,43 +1192,7 @@
         <w:jc w:val="both"/>
       </w:pPr>
       <w:r>
-        <w:t xml:space="preserve">Simulator-first on qBraid: statevector ≤12 qubits, sparse/TN to ≈16, GPU beyond. </w:t>
-      </w:r>
-      <w:r>
-        <w:rPr>
-          <w:b/>
-        </w:rPr>
-        <w:t>Resource estimates</w:t>
-      </w:r>
-      <w:r>
-        <w:t xml:space="preserve"> (gate-Trotter, 20 layers): n=8/10/12 use </w:t>
-      </w:r>
-      <w:r>
-        <w:rPr>
-          <w:b/>
-        </w:rPr>
-        <w:t>220/480/760 two-qubit + 160/200/240 one-qubit</w:t>
-      </w:r>
-      <w:r>
-        <w:t xml:space="preserve"> gates, yielding </w:t>
-      </w:r>
-      <w:r>
-        <w:rPr>
-          <w:b/>
-        </w:rPr>
-        <w:t>36/55/78 observables</w:t>
-      </w:r>
-      <w:r>
-        <w:t xml:space="preserve"> — all Z-basis-diagonal, so </w:t>
-      </w:r>
-      <w:r>
-        <w:rPr>
-          <w:b/>
-        </w:rPr>
-        <w:t>one S-shot set (S≈2–8k, ε≈1/√S) reads every observable</w:t>
-      </w:r>
-      <w:r>
-        <w:t xml:space="preserve"> (statevector build ≤~1 min over this range).</w:t>
+        <w:t>Simulator-first on qBraid: statevector to 12 qubits, sparse/TN to ≈16, GPU beyond. Resource estimates (gate-Trotter, 20 layers): n=8/10/12 use 220/480/760 two-qubit plus 160/200/240 one-qubit gates, yielding 36/55/78 observables — all Z-basis-diagonal, so one S-shot set (S≈2–8k, ε≈1/√S) reads every observable (statevector build under ~1 min over this range).</w:t>
       </w:r>
     </w:p>
     <w:p>
@@ -2181,49 +1200,7 @@
         <w:jc w:val="both"/>
       </w:pPr>
       <w:r>
-        <w:rPr>
-          <w:b/>
-        </w:rPr>
-        <w:t>QPU validation</w:t>
-      </w:r>
-      <w:r>
-        <w:t xml:space="preserve"> uses this gate-Trotter circuit on </w:t>
-      </w:r>
-      <w:r>
-        <w:rPr>
-          <w:b/>
-        </w:rPr>
-        <w:t>IonQ / IQM / Rigetti</w:t>
-      </w:r>
-      <w:r>
-        <w:t xml:space="preserve"> via qBraid — the random-sparse Ising needs </w:t>
-      </w:r>
-      <w:r>
-        <w:rPr>
-          <w:i/>
-        </w:rPr>
-        <w:t>fewer</w:t>
-      </w:r>
-      <w:r>
-        <w:t xml:space="preserve"> two-qubit gates than an all-to-all reservoir, easing NISQ mapping — with </w:t>
-      </w:r>
-      <w:r>
-        <w:rPr>
-          <w:b/>
-        </w:rPr>
-        <w:t>ZNE + measurement mitigation</w:t>
-      </w:r>
-      <w:r>
-        <w:t xml:space="preserve"> and a classical cross-check per run. The submission path is </w:t>
-      </w:r>
-      <w:r>
-        <w:rPr>
-          <w:b/>
-        </w:rPr>
-        <w:t>executable now</w:t>
-      </w:r>
-      <w:r>
-        <w:t xml:space="preserve"> (</w:t>
+        <w:t>QPU validation uses this gate-Trotter circuit on IonQ, IQM and Rigetti via qBraid — the random- sparse Ising needs fewer two-qubit gates than an all-to-all reservoir, which eases NISQ mapping — with ZNE, measurement mitigation, and a classical cross-check on every run. The submission path is executable now (</w:t>
       </w:r>
       <w:r>
         <w:rPr>
@@ -2232,133 +1209,16 @@
         <w:t>cli.py run qsubmit</w:t>
       </w:r>
       <w:r>
-        <w:t xml:space="preserve">): on a simulator it (i) reproduces the engine to </w:t>
+        <w:t xml:space="preserve">): on a simulator it (i) reproduces the engine to 3.9×10⁻¹⁶ (the per-run classical cross-check), (ii) characterizes the shot budget (ε≈1/√S; feature error 0.046→0.0066 at S=256→16k; gate-Trotter(20) adds ≈0.04), and (iii) demonstrates zero-noise extrapolation under a depolarizing sweep. On real hardware, the full mitigated protocol ran first on Rigetti Cepheus-1-108q (12 logged cloud jobs; bit order auto-detected; readout 2.3%/6.4%). After lattice routing, scale-1 already exceeds the coherence budget — the accumulated two-qubit-gate cost §5.4 predicts, measured on metal (ZNE marginal; a 4k-shot replication showed the beyond-limit regime stable under day-scale drift). The pre-registered Garnet protocol replicated the regime on a second vendor (raw 0.230 exceeds our routing-free 0.171 forecast — prediction (iii) confirmed). Execution also surfaced a platform-level finding: negative-angle rotations are silently lost server-side on the IonQ route (RY(π)RY(−π) arrives as net RY(π)), which corrupts ZNE's negated folds; we hardened the emitter (mod-2π) and validated the diagonal calibration on-device. The routing-free IonQ Forte-1 campaign then ran under the pre-committed manifest. A smoke gate measured a 2,000-gate-per-circuit ceiling on the native route, so per abort rule the campaign ran scale-1-only (500 shots — a disclosed, cost-forced deviation, s.e.≈0.004). Raw error 0.104, below the 0.196 depolarized limit and below every superconducting n=8 number: a </w:t>
       </w:r>
       <w:r>
         <w:rPr>
           <w:b/>
         </w:rPr>
-        <w:t>3.9×10⁻¹⁶</w:t>
+        <w:t>signal-bearing</w:t>
       </w:r>
       <w:r>
-        <w:t xml:space="preserve"> (the per-run classical cross-check), (ii) characterizes the </w:t>
-      </w:r>
-      <w:r>
-        <w:rPr>
-          <w:b/>
-        </w:rPr>
-        <w:t>shot budget</w:t>
-      </w:r>
-      <w:r>
-        <w:t xml:space="preserve"> (ε≈1/√S; feature error 0.046→0.0066 at S=256→16k; gate-Trotter(20) adds ≈0.04), and (iii) demonstrates </w:t>
-      </w:r>
-      <w:r>
-        <w:rPr>
-          <w:b/>
-        </w:rPr>
-        <w:t>zero-noise extrapolation</w:t>
-      </w:r>
-      <w:r>
-        <w:t xml:space="preserve"> under a depolarizing sweep. </w:t>
-      </w:r>
-      <w:r>
-        <w:rPr>
-          <w:b/>
-        </w:rPr>
-        <w:t>Executed on real hardware:</w:t>
-      </w:r>
-      <w:r>
-        <w:t xml:space="preserve"> the full mitigated protocol ran first on </w:t>
-      </w:r>
-      <w:r>
-        <w:rPr>
-          <w:b/>
-        </w:rPr>
-        <w:t>Rigetti Cepheus-1-108q</w:t>
-      </w:r>
-      <w:r>
-        <w:t xml:space="preserve"> (12 logged cloud jobs; bit order auto-detected; readout 2.3%/6.4%): after lattice routing, scale-1 already exceeds the coherence budget — the accumulated two-qubit-gate cost §5.4 predicts, measured on metal (ZNE marginal; a 4k-shot replication showed the beyond-limit regime stable under day-scale drift). The pre-registered </w:t>
-      </w:r>
-      <w:r>
-        <w:rPr>
-          <w:b/>
-        </w:rPr>
-        <w:t>Garnet protocol</w:t>
-      </w:r>
-      <w:r>
-        <w:t xml:space="preserve"> replicated the regime on a second vendor (raw 0.230 &gt; our routing-free 0.171 forecast — </w:t>
-      </w:r>
-      <w:r>
-        <w:rPr>
-          <w:b/>
-        </w:rPr>
-        <w:t>prediction (iii) confirmed</w:t>
-      </w:r>
-      <w:r>
-        <w:t xml:space="preserve">). Execution also surfaced a </w:t>
-      </w:r>
-      <w:r>
-        <w:rPr>
-          <w:b/>
-        </w:rPr>
-        <w:t>platform-level finding</w:t>
-      </w:r>
-      <w:r>
-        <w:t xml:space="preserve">: negative-angle rotations are </w:t>
-      </w:r>
-      <w:r>
-        <w:rPr>
-          <w:b/>
-        </w:rPr>
-        <w:t>silently lost server-side on the IonQ route</w:t>
-      </w:r>
-      <w:r>
-        <w:t xml:space="preserve"> (RY(π)RY(−π) → net RY(π)), corrupting ZNE's negated folds; we hardened the emitter (mod-2π) and validated the diagonal calibration on-device. The routing-free </w:t>
-      </w:r>
-      <w:r>
-        <w:rPr>
-          <w:b/>
-        </w:rPr>
-        <w:t>IonQ Forte-1 campaign</w:t>
-      </w:r>
-      <w:r>
-        <w:t xml:space="preserve"> then ran under the pre-committed manifest: a smoke gate measured a </w:t>
-      </w:r>
-      <w:r>
-        <w:rPr>
-          <w:b/>
-        </w:rPr>
-        <w:t>2,000-gate/circuit ceiling</w:t>
-      </w:r>
-      <w:r>
-        <w:t xml:space="preserve"> on the native route, so per abort rule it ran scale-1-only (500 shots — a disclosed, cost-forced deviation, s.e.≈0.004). </w:t>
-      </w:r>
-      <w:r>
-        <w:rPr>
-          <w:b/>
-        </w:rPr>
-        <w:t>Raw 0.104 — below the 0.196 depolarized limit</w:t>
-      </w:r>
-      <w:r>
-        <w:t xml:space="preserve"> and every superconducting n=8 number: a </w:t>
-      </w:r>
-      <w:r>
-        <w:rPr>
-          <w:b/>
-        </w:rPr>
-        <w:t>signal-bearing hardware execution</w:t>
-      </w:r>
-      <w:r>
-        <w:t xml:space="preserve"> of this reservoir (</w:t>
-      </w:r>
-      <w:r>
-        <w:rPr>
-          <w:b/>
-        </w:rPr>
-        <w:t>prediction (ii) confirmed</w:t>
-      </w:r>
-      <w:r>
-        <w:t xml:space="preserve">; </w:t>
+        <w:t xml:space="preserve"> hardware execution of this reservoir (prediction (ii) confirmed; </w:t>
       </w:r>
       <w:r>
         <w:rPr>
@@ -2367,16 +1227,7 @@
         <w:t>results/qpu_hardware_findings.md</w:t>
       </w:r>
       <w:r>
-        <w:t xml:space="preserve">). A pre-registered </w:t>
-      </w:r>
-      <w:r>
-        <w:rPr>
-          <w:b/>
-        </w:rPr>
-        <w:t>hardware scaling program</w:t>
-      </w:r>
-      <w:r>
-        <w:t xml:space="preserve"> (</w:t>
+        <w:t>). A pre-registered hardware scaling program (</w:t>
       </w:r>
       <w:r>
         <w:rPr>
@@ -2385,70 +1236,7 @@
         <w:t>results/qpu_scaling_outlook.md</w:t>
       </w:r>
       <w:r>
-        <w:t xml:space="preserve">) then refuted our own statements on metal (Fig. 3): Garnet turns </w:t>
-      </w:r>
-      <w:r>
-        <w:rPr>
-          <w:b/>
-        </w:rPr>
-        <w:t>signal-bearing at n=10/n=12</w:t>
-      </w:r>
-      <w:r>
-        <w:t xml:space="preserve"> while the </w:t>
-      </w:r>
-      <w:r>
-        <w:rPr>
-          <w:b/>
-        </w:rPr>
-        <w:t>same-session seed-0 n=8 anchor</w:t>
-      </w:r>
-      <w:r>
-        <w:t xml:space="preserve"> stays scrambled — but a pre-registered cross-seed control (</w:t>
-      </w:r>
-      <w:r>
-        <w:rPr>
-          <w:b/>
-        </w:rPr>
-        <w:t>S7</w:t>
-      </w:r>
-      <w:r>
-        <w:t xml:space="preserve">) found an </w:t>
-      </w:r>
-      <w:r>
-        <w:rPr>
-          <w:b/>
-        </w:rPr>
-        <w:t>independent seed-1 n=8 instance signal-bearing</w:t>
-      </w:r>
-      <w:r>
-        <w:t xml:space="preserve"> in the same session, so the n=8 scrambling is </w:t>
-      </w:r>
-      <w:r>
-        <w:rPr>
-          <w:b/>
-        </w:rPr>
-        <w:t>specific to the seed-0 instance, not a size law</w:t>
-      </w:r>
-      <w:r>
-        <w:t xml:space="preserve"> (seed-1 n=10 also signal-bearing) — and the newer-generation </w:t>
-      </w:r>
-      <w:r>
-        <w:rPr>
-          <w:b/>
-        </w:rPr>
-        <w:t>Emerald is signal-bearing at the very size Garnet scrambles</w:t>
-      </w:r>
-      <w:r>
-        <w:t xml:space="preserve">, reproduced in a </w:t>
-      </w:r>
-      <w:r>
-        <w:rPr>
-          <w:b/>
-        </w:rPr>
-        <w:t>same-window two-chip pair</w:t>
-      </w:r>
-      <w:r>
-        <w:t xml:space="preserve">: generation-dependent at fixed size, temporally controlled. The program spans reservoir size, encoding density, shot budget and noise; Fig. 3 collects the hardware verdicts. The criterion is exactly </w:t>
+        <w:t xml:space="preserve">) then refuted our own statements on metal (Fig. 3). Garnet turns signal-bearing at n=10 and n=12 while the same-session seed-0 n=8 anchor stays scrambled; a pre-registered cross-seed control (S7) found an independent seed-1 n=8 instance signal-bearing in the same session, so the n=8 scrambling is specific to the seed-0 instance, not a size law (seed-1 n=10 is signal-bearing as well). The newer-generation Emerald is signal-bearing at the very size Garnet scrambles, reproduced in a same-window two-chip pair — generation-dependent at fixed size, temporally controlled. The program spans reservoir size, encoding density, shot budget and noise; Fig. 3 collects the hardware verdicts. The criterion is exactly </w:t>
       </w:r>
       <w:r>
         <w:rPr>
@@ -2457,16 +1245,7 @@
         <w:t>SNR &gt; 1</w:t>
       </w:r>
       <w:r>
-        <w:t xml:space="preserve"> — raw error is mean|F−F_exact|, the limit is mean|F_exact| — so the bar is </w:t>
-      </w:r>
-      <w:r>
-        <w:rPr>
-          <w:b/>
-        </w:rPr>
-        <w:t>instance</w:t>
-      </w:r>
-      <w:r>
-        <w:t>-matched (signal magnitude is a circuit property, not an n property) and the test transfers to any quantum feature map:</w:t>
+        <w:t xml:space="preserve"> — raw error is mean|F−F_exact|, the limit is mean|F_exact| — so the bar is instance-matched (signal magnitude is a circuit property, not an n property) and the test transfers to any quantum feature map:</w:t>
       </w:r>
     </w:p>
     <w:p>
@@ -2568,16 +1347,7 @@
         <w:t>Execution provenance (externally verifiable).</w:t>
       </w:r>
       <w:r>
-        <w:t xml:space="preserve"> Every campaign ran against pre-committed predictions — the ten funded ones under a committed manifest (abort/decision rules fixed </w:t>
-      </w:r>
-      <w:r>
-        <w:rPr>
-          <w:i/>
-        </w:rPr>
-        <w:t>before</w:t>
-      </w:r>
-      <w:r>
-        <w:t xml:space="preserve"> each launch); every funded-campaign job embeds the repo commit hash and campaign tag in qBraid's timestamped records — a hash-preimage commitment that predictions predate data — and billing matched estimates to the half-credit (</w:t>
+        <w:t xml:space="preserve"> Every campaign ran against pre-committed predictions — the ten funded ones under a committed manifest whose abort and decision rules were fixed before each launch. Every funded-campaign job embeds the repo commit hash and campaign tag in qBraid's timestamped records, a hash-preimage commitment that the predictions predate the data, and billing matched estimates to the half-credit (</w:t>
       </w:r>
       <w:r>
         <w:rPr>
@@ -2586,16 +1356,7 @@
         <w:t>results/CREDIT_BUDGET.md</w:t>
       </w:r>
       <w:r>
-        <w:t xml:space="preserve">: ≈64k credits). Bootstrap from the committed counts re-derives every number above and puts </w:t>
-      </w:r>
-      <w:r>
-        <w:rPr>
-          <w:b/>
-        </w:rPr>
-        <w:t>each of the nine bootstrapped regime claims 9.7–23.9σ beyond shot noise</w:t>
-      </w:r>
-      <w:r>
-        <w:t>; a readout-corrected fingerprint attributes the scrambled regime to predominantly coherent error (</w:t>
+        <w:t>: ≈64k credits). Bootstrap from the committed counts re-derives every number above and puts each of the nine bootstrapped regime claims 9.7–23.9σ beyond shot noise; a readout-corrected fingerprint attributes the scrambled regime to predominantly coherent error (</w:t>
       </w:r>
       <w:r>
         <w:rPr>
@@ -2613,7 +1374,7 @@
         <w:t>qpu_fingerprint</w:t>
       </w:r>
       <w:r>
-        <w:t>). Controls were bought where needed: a Rigetti replication (day-drift), a same-session n=8 anchor, and a same-window two-chip pair (generation). S5–S6 pre-committed; S7 executed (above).</w:t>
+        <w:t>). Controls were bought where they were needed: a Rigetti replication (day-drift), a same-session n=8 anchor, and a same-window two-chip pair (generation). S5–S6 are pre-committed; S7 executed (above).</w:t>
       </w:r>
     </w:p>
     <w:p>
@@ -2621,7 +1382,7 @@
         <w:pStyle w:val="Heading2"/>
       </w:pPr>
       <w:r>
-        <w:t>7. Limitations (stated plainly)</w:t>
+        <w:t>7. Limitations</w:t>
       </w:r>
     </w:p>
     <w:p>
@@ -2629,88 +1390,7 @@
         <w:jc w:val="both"/>
       </w:pPr>
       <w:r>
-        <w:t xml:space="preserve">(i) </w:t>
-      </w:r>
-      <w:r>
-        <w:rPr>
-          <w:b/>
-        </w:rPr>
-        <w:t>No quantum advantage</w:t>
-      </w:r>
-      <w:r>
-        <w:t xml:space="preserve"> is demonstrated at the ≤16-qubit simulable scale; HAR-X (classical, linear) is the best model on this task. (ii) The RV sample ends Feb-2020 (COVID just outside); broader assets/periods are daily-proxy supporting studies (v2_research — same negative), not 5-min RV. (iii) Task-level noise: per-layer channels (§5.4) and shot noise; combined noisy-plus-shot execution is measured in the QPU campaigns (§6). (iv) g is regularization- and configuration-dependent (qualitative only). (v) Superconducting n=8 execution is a </w:t>
-      </w:r>
-      <w:r>
-        <w:rPr>
-          <w:b/>
-        </w:rPr>
-        <w:t>characterized negative</w:t>
-      </w:r>
-      <w:r>
-        <w:t xml:space="preserve"> (Fig. 3; day-drift exceeds shot noise, so </w:t>
-      </w:r>
-      <w:r>
-        <w:rPr>
-          <w:i/>
-        </w:rPr>
-        <w:t>regime</w:t>
-      </w:r>
-      <w:r>
-        <w:t xml:space="preserve">, not point value, is the robust claim), while n=10/n=12 and the newer generation land inside their limits: the wall is instance- and generation-dependent, not absolute (n=8 scrambling is seed-0-instance-specific — S7; and in a 30-instance ensemble the scrambled instance is among the </w:t>
-      </w:r>
-      <w:r>
-        <w:rPr>
-          <w:i/>
-        </w:rPr>
-        <w:t>sparsest</w:t>
-      </w:r>
-      <w:r>
-        <w:t xml:space="preserve">, so gate count </w:t>
-      </w:r>
-      <w:r>
-        <w:rPr>
-          <w:b/>
-        </w:rPr>
-        <w:t>anti-predicts</w:t>
-      </w:r>
-      <w:r>
-        <w:t xml:space="preserve"> the wall — §8). Mitigation recovery on hardware is at best marginal (ZNE 0.223→0.217 on Rigetti; the ion chain is flat). (vi) Distinctness and full-rank entanglement are </w:t>
-      </w:r>
-      <w:r>
-        <w:rPr>
-          <w:i/>
-        </w:rPr>
-        <w:t>necessary, not sufficient</w:t>
-      </w:r>
-      <w:r>
-        <w:t xml:space="preserve"> (measured, §3); whether they convert beyond the simulable frontier is open. A quantum-data probe shows the QRC natively reads nonlinear </w:t>
-      </w:r>
-      <w:r>
-        <w:rPr>
-          <w:i/>
-        </w:rPr>
-        <w:t>state</w:t>
-      </w:r>
-      <w:r>
-        <w:t xml:space="preserve"> functionals a linear readout cannot, but the proper baseline — </w:t>
-      </w:r>
-      <w:r>
-        <w:rPr>
-          <w:b/>
-        </w:rPr>
-        <w:t>classical shadows</w:t>
-      </w:r>
-      <w:r>
-        <w:t xml:space="preserve"> (Huang–Kueng–Preskill 2020) at matched budgets — </w:t>
-      </w:r>
-      <w:r>
-        <w:rPr>
-          <w:b/>
-        </w:rPr>
-        <w:t>wins wherever real information is extracted</w:t>
-      </w:r>
-      <w:r>
-        <w:t>, including the shadows-hard Tr(ρ³): closed negatively at simulable scale (</w:t>
+        <w:t>(i) No quantum advantage is demonstrated at the ≤16-qubit simulable scale; HAR-X, a classical linear model, is the best model on this task. (ii) The RV sample ends Feb-2020 (COVID falls just outside); broader assets and periods are daily-proxy supporting studies (v2_research — same negative), not 5-min RV. (iii) Task-level noise: per-layer channels (§5.4) and shot noise; combined noisy-plus-shot execution is measured in the QPU campaigns (§6). (iv) g is regularization- and configuration-dependent, so we use it qualitatively only. (v) Superconducting n=8 execution is a characterized negative (Fig. 3; day-drift exceeds shot noise, so the regime, not the point value, is the robust claim), while n=10/n=12 and the newer generation land inside their limits. The wall is instance- and generation-dependent, not absolute: the n=8 scrambling is seed-0-instance-specific (S7), and in a 30-instance ensemble the scrambled instance is among the sparsest, so gate count anti-predicts the wall (§8). Mitigation recovery on hardware is at best marginal (ZNE 0.223→0.217 on Rigetti; the ion chain is flat). (vi) Distinctness and full-rank entanglement are necessary but not sufficient (measured, §3); whether they convert beyond the simulable frontier remains open. A quantum-data probe shows the QRC natively reads nonlinear state functionals a linear readout cannot, but the proper baseline — classical shadows (Huang–Kueng–Preskill 2020) at matched budgets — wins wherever real information is extracted, including the shadows-hard Tr(ρ³): closed negatively at simulable scale (</w:t>
       </w:r>
       <w:r>
         <w:rPr>
@@ -2735,31 +1415,7 @@
         <w:jc w:val="both"/>
       </w:pPr>
       <w:r>
-        <w:rPr>
-          <w:b/>
-        </w:rPr>
-        <w:t>The durable asset is the audit instrument</w:t>
-      </w:r>
-      <w:r>
-        <w:t xml:space="preserve"> — and our data shows it is </w:t>
-      </w:r>
-      <w:r>
-        <w:rPr>
-          <w:i/>
-        </w:rPr>
-        <w:t>necessary</w:t>
-      </w:r>
-      <w:r>
-        <w:t xml:space="preserve">. Structure </w:t>
-      </w:r>
-      <w:r>
-        <w:rPr>
-          <w:b/>
-        </w:rPr>
-        <w:t>mis-ranked both instances we measured on metal</w:t>
-      </w:r>
-      <w:r>
-        <w:t>, and across 30 instances no structural quantity survives multiplicity correction as a predictor of the hardware bar, nor predicts accuracy at all. Structure does not give the answer; measurement does (</w:t>
+        <w:t>The durable asset is the audit instrument, and our data shows it is necessary. Structure mis-ranked both instances we measured on metal, and across 30 instances no structural quantity survives multiplicity correction as a predictor of the hardware bar, nor predicts accuracy at all. Structure does not give the answer; measurement does (</w:t>
       </w:r>
       <w:r>
         <w:rPr>
@@ -2768,52 +1424,7 @@
         <w:t>instance_ensemble_findings.md</w:t>
       </w:r>
       <w:r>
-        <w:t xml:space="preserve">, exploratory). Hence </w:t>
-      </w:r>
-      <w:r>
-        <w:rPr>
-          <w:b/>
-        </w:rPr>
-        <w:t>trust in a quantum yes/no</w:t>
-      </w:r>
-      <w:r>
-        <w:t xml:space="preserve">: a pre-registered, vendor-neutral </w:t>
-      </w:r>
-      <w:r>
-        <w:rPr>
-          <w:b/>
-        </w:rPr>
-        <w:t>workload→QPU qualification</w:t>
-      </w:r>
-      <w:r>
-        <w:t xml:space="preserve"> earned by an instrument that </w:t>
-      </w:r>
-      <w:r>
-        <w:rPr>
-          <w:b/>
-        </w:rPr>
-        <w:t>falsifies its own predictions</w:t>
-      </w:r>
-      <w:r>
-        <w:t xml:space="preserve"> — it split our runs </w:t>
-      </w:r>
-      <w:r>
-        <w:rPr>
-          <w:b/>
-        </w:rPr>
-        <w:t>five signal-bearing, two scrambled</w:t>
-      </w:r>
-      <w:r>
-        <w:t xml:space="preserve"> (Fig. 3) at ≈$70–$205 per campaign. Target profiles only; no customers or LOIs claimed. </w:t>
-      </w:r>
-      <w:r>
-        <w:rPr>
-          <w:b/>
-        </w:rPr>
-        <w:t>Desk impact</w:t>
-      </w:r>
-      <w:r>
-        <w:t xml:space="preserve"> (</w:t>
+        <w:t>, exploratory). What follows is trust in a quantum yes/no: a pre-registered, vendor-neutral workload→QPU qualification, earned by an instrument that falsifies its own predictions. It split our runs five signal-bearing, two scrambled (Fig. 3) at ≈$70–$205 per campaign. Target profiles only; no customers or LOIs are claimed. On desk impact (</w:t>
       </w:r>
       <w:r>
         <w:rPr>
@@ -2822,43 +1433,7 @@
         <w:t>cli.py run economics</w:t>
       </w:r>
       <w:r>
-        <w:t xml:space="preserve">): vol-timing the GFC window </w:t>
-      </w:r>
-      <w:r>
-        <w:rPr>
-          <w:b/>
-        </w:rPr>
-        <w:t>halves max drawdown (−61%→−32%)</w:t>
-      </w:r>
-      <w:r>
-        <w:t xml:space="preserve"> and lifts Sharpe </w:t>
-      </w:r>
-      <w:r>
-        <w:rPr>
-          <w:b/>
-        </w:rPr>
-        <w:t>0.00→0.14</w:t>
-      </w:r>
-      <w:r>
-        <w:t xml:space="preserve"> net of costs — risk control, not alpha — but </w:t>
-      </w:r>
-      <w:r>
-        <w:rPr>
-          <w:b/>
-        </w:rPr>
-        <w:t>plain HAR</w:t>
-      </w:r>
-      <w:r>
-        <w:t xml:space="preserve"> captures it (CE fee −25bp/yr): the lever is </w:t>
-      </w:r>
-      <w:r>
-        <w:rPr>
-          <w:b/>
-        </w:rPr>
-        <w:t>a simple RV forecast, not quantum hardware</w:t>
-      </w:r>
-      <w:r>
-        <w:t xml:space="preserve">. </w:t>
+        <w:t xml:space="preserve">): vol-timing the GFC window halves max drawdown (−61%→−32%) and lifts Sharpe from 0.00 to 0.14 net of costs — risk control, not alpha — but plain HAR captures it (CE fee −25bp/yr). The lever is a simple RV forecast, not quantum hardware. </w:t>
       </w:r>
       <w:r>
         <w:rPr>

</xml_diff>

<commit_message>
References: full scholarly citations, every entry externally verified
The name-year stubs are replaced with complete citations (authors, year,
title, venue, volume/pages or arXiv ID), alphabetized. Each of the 20
entries was verified against arXiv/publisher records before inclusion;
details that could not be confirmed (e.g. some article numbers) are
omitted rather than guessed. Notable verifications: Antoncich et al. 2026
is arXiv:2602.14641 (neutral-atom Aquila QRC, the noise-as-regularizer
source cited in results/mnist_noise_findings.md); Hou et al. 2025 is
arXiv:2508.12383 (NMR correlated-spins QRC, later PRL); Kobayashi & Motome
2026 is PRL 136, 040602; Li et al. is PRR / arXiv:2505.13933.

Pagination verified: 5 body pages unchanged, References fill exactly one
page (p6). Inline name-year citations in the body match the list.

Co-Authored-By: Claude Fable 5 <noreply@anthropic.com>
Claude-Session: https://claude.ai/code/session_01SH3wHCzTCUP7HwrV3NZtab
</commit_message>
<xml_diff>
--- a/PHASE3_PAPER.docx
+++ b/PHASE3_PAPER.docx
@@ -1463,7 +1463,285 @@
         <w:jc w:val="both"/>
       </w:pPr>
       <w:r>
-        <w:t>Kornjača et al. 2024 · Zhu et al. 2025 · Ahmed, Tennie &amp; Magri 2025 · Li et al. 2025 · Tandon et al. 2025 · Hou et al. 2025 · Čindrak et al. 2026 · Antoncich et al. 2026 · Kobayashi &amp; Motome 2026 · Huang et al. 2021 · Huang, Kueng &amp; Preskill 2020 (classical shadows) · Dambre et al. 2012 · Corsi 2009 · Patton 2011 · Hansen et al. 2011 · Harvey et al. 1997 · Diebold &amp; Mariano 1995 · Bollerslev 1986 · Jaeger 2001 · Heber et al. 2009.</w:t>
+        <w:t xml:space="preserve">Ahmed, O., Tennie, F. &amp; Magri, L. (2025). Robust quantum reservoir computers for forecasting chaotic dynamics: generalized synchronization and stability. </w:t>
+      </w:r>
+      <w:r>
+        <w:rPr>
+          <w:i/>
+        </w:rPr>
+        <w:t>Proceedings of the Royal Society A</w:t>
+      </w:r>
+      <w:r>
+        <w:t xml:space="preserve"> 481, 20250550. arXiv:2506.22335.</w:t>
+      </w:r>
+    </w:p>
+    <w:p>
+      <w:pPr>
+        <w:jc w:val="both"/>
+      </w:pPr>
+      <w:r>
+        <w:t>Antoncich, L., Moodley, Y., Varetto, U., Wang, J., Wurtz, J., Chen, J., Elahi, P. J. &amp; Myers, C. R. (2026). Quantum reservoir computing with neutral atoms on a small, complex, medical dataset. arXiv:2602.14641.</w:t>
+      </w:r>
+    </w:p>
+    <w:p>
+      <w:pPr>
+        <w:jc w:val="both"/>
+      </w:pPr>
+      <w:r>
+        <w:t xml:space="preserve">Bollerslev, T. (1986). Generalized autoregressive conditional heteroskedasticity. </w:t>
+      </w:r>
+      <w:r>
+        <w:rPr>
+          <w:i/>
+        </w:rPr>
+        <w:t>Journal of Econometrics</w:t>
+      </w:r>
+      <w:r>
+        <w:t xml:space="preserve"> 31(3), 307–327.</w:t>
+      </w:r>
+    </w:p>
+    <w:p>
+      <w:pPr>
+        <w:jc w:val="both"/>
+      </w:pPr>
+      <w:r>
+        <w:t>Čindrak, S., et al. (2026). Memory–nonlinearity trade-off across quantum reservoir computing frameworks. arXiv:2603.21371.</w:t>
+      </w:r>
+    </w:p>
+    <w:p>
+      <w:pPr>
+        <w:jc w:val="both"/>
+      </w:pPr>
+      <w:r>
+        <w:t xml:space="preserve">Corsi, F. (2009). A simple approximate long-memory model of realized volatility. </w:t>
+      </w:r>
+      <w:r>
+        <w:rPr>
+          <w:i/>
+        </w:rPr>
+        <w:t>Journal of Financial Econometrics</w:t>
+      </w:r>
+      <w:r>
+        <w:t xml:space="preserve"> 7(2), 174–196.</w:t>
+      </w:r>
+    </w:p>
+    <w:p>
+      <w:pPr>
+        <w:jc w:val="both"/>
+      </w:pPr>
+      <w:r>
+        <w:t xml:space="preserve">Dambre, J., Verstraeten, D., Schrauwen, B. &amp; Massar, S. (2012). Information processing capacity of dynamical systems. </w:t>
+      </w:r>
+      <w:r>
+        <w:rPr>
+          <w:i/>
+        </w:rPr>
+        <w:t>Scientific Reports</w:t>
+      </w:r>
+      <w:r>
+        <w:t xml:space="preserve"> 2, 514.</w:t>
+      </w:r>
+    </w:p>
+    <w:p>
+      <w:pPr>
+        <w:jc w:val="both"/>
+      </w:pPr>
+      <w:r>
+        <w:t xml:space="preserve">Diebold, F. X. &amp; Mariano, R. S. (1995). Comparing predictive accuracy. </w:t>
+      </w:r>
+      <w:r>
+        <w:rPr>
+          <w:i/>
+        </w:rPr>
+        <w:t>Journal of Business &amp; Economic Statistics</w:t>
+      </w:r>
+      <w:r>
+        <w:t xml:space="preserve"> 13(3), 253–263.</w:t>
+      </w:r>
+    </w:p>
+    <w:p>
+      <w:pPr>
+        <w:jc w:val="both"/>
+      </w:pPr>
+      <w:r>
+        <w:t xml:space="preserve">Hansen, P. R., Lunde, A. &amp; Nason, J. M. (2011). The model confidence set. </w:t>
+      </w:r>
+      <w:r>
+        <w:rPr>
+          <w:i/>
+        </w:rPr>
+        <w:t>Econometrica</w:t>
+      </w:r>
+      <w:r>
+        <w:t xml:space="preserve"> 79(2), 453–497.</w:t>
+      </w:r>
+    </w:p>
+    <w:p>
+      <w:pPr>
+        <w:jc w:val="both"/>
+      </w:pPr>
+      <w:r>
+        <w:t xml:space="preserve">Harvey, D., Leybourne, S. &amp; Newbold, P. (1997). Testing the equality of prediction mean squared errors. </w:t>
+      </w:r>
+      <w:r>
+        <w:rPr>
+          <w:i/>
+        </w:rPr>
+        <w:t>International Journal of Forecasting</w:t>
+      </w:r>
+      <w:r>
+        <w:t xml:space="preserve"> 13(2), 281–291.</w:t>
+      </w:r>
+    </w:p>
+    <w:p>
+      <w:pPr>
+        <w:jc w:val="both"/>
+      </w:pPr>
+      <w:r>
+        <w:t>Heber, G., Lunde, A., Shephard, N. &amp; Sheppard, K. (2009). Oxford-Man Institute's Realized Library. Oxford-Man Institute, University of Oxford.</w:t>
+      </w:r>
+    </w:p>
+    <w:p>
+      <w:pPr>
+        <w:jc w:val="both"/>
+      </w:pPr>
+      <w:r>
+        <w:t xml:space="preserve">Hou, Y., Hua, J., Wu, Z., Xia, W., Chen, Y., Li, X., Li, Z., Peng, X. &amp; Du, J. (2025). High-accuracy temporal prediction via experimental quantum reservoir computing in correlated spins. arXiv:2508.12383; </w:t>
+      </w:r>
+      <w:r>
+        <w:rPr>
+          <w:i/>
+        </w:rPr>
+        <w:t>Physical Review Letters</w:t>
+      </w:r>
+      <w:r>
+        <w:t xml:space="preserve"> (2026).</w:t>
+      </w:r>
+    </w:p>
+    <w:p>
+      <w:pPr>
+        <w:jc w:val="both"/>
+      </w:pPr>
+      <w:r>
+        <w:t xml:space="preserve">Huang, H.-Y., Broughton, M., Mohseni, M., Babbush, R., Boixo, S., Neven, H. &amp; McClean, J. R. (2021). Power of data in quantum machine learning. </w:t>
+      </w:r>
+      <w:r>
+        <w:rPr>
+          <w:i/>
+        </w:rPr>
+        <w:t>Nature Communications</w:t>
+      </w:r>
+      <w:r>
+        <w:t xml:space="preserve"> 12, 2631.</w:t>
+      </w:r>
+    </w:p>
+    <w:p>
+      <w:pPr>
+        <w:jc w:val="both"/>
+      </w:pPr>
+      <w:r>
+        <w:t xml:space="preserve">Huang, H.-Y., Kueng, R. &amp; Preskill, J. (2020). Predicting many properties of a quantum system from very few measurements. </w:t>
+      </w:r>
+      <w:r>
+        <w:rPr>
+          <w:i/>
+        </w:rPr>
+        <w:t>Nature Physics</w:t>
+      </w:r>
+      <w:r>
+        <w:t xml:space="preserve"> 16, 1050–1057.</w:t>
+      </w:r>
+    </w:p>
+    <w:p>
+      <w:pPr>
+        <w:jc w:val="both"/>
+      </w:pPr>
+      <w:r>
+        <w:t>Jaeger, H. (2001). The "echo state" approach to analysing and training recurrent neural networks. GMD Report 148, German National Research Center for Information Technology.</w:t>
+      </w:r>
+    </w:p>
+    <w:p>
+      <w:pPr>
+        <w:jc w:val="both"/>
+      </w:pPr>
+      <w:r>
+        <w:t xml:space="preserve">Kobayashi, K. &amp; Motome, Y. (2026). Edge of many-body quantum chaos in quantum reservoir computing. </w:t>
+      </w:r>
+      <w:r>
+        <w:rPr>
+          <w:i/>
+        </w:rPr>
+        <w:t>Physical Review Letters</w:t>
+      </w:r>
+      <w:r>
+        <w:t xml:space="preserve"> 136, 040602. arXiv:2506.17547.</w:t>
+      </w:r>
+    </w:p>
+    <w:p>
+      <w:pPr>
+        <w:jc w:val="both"/>
+      </w:pPr>
+      <w:r>
+        <w:t>Kornjača, M., et al. (2024). Large-scale quantum reservoir learning with an analog quantum computer. arXiv:2407.02553.</w:t>
+      </w:r>
+    </w:p>
+    <w:p>
+      <w:pPr>
+        <w:jc w:val="both"/>
+      </w:pPr>
+      <w:r>
+        <w:t xml:space="preserve">Li, Q., Mukhopadhyay, C., Bayat, A. &amp; Habibnia, A. (2026). Quantum reservoir computing for realized volatility forecasting. </w:t>
+      </w:r>
+      <w:r>
+        <w:rPr>
+          <w:i/>
+        </w:rPr>
+        <w:t>Physical Review Research</w:t>
+      </w:r>
+      <w:r>
+        <w:t>; arXiv:2505.13933.</w:t>
+      </w:r>
+    </w:p>
+    <w:p>
+      <w:pPr>
+        <w:jc w:val="both"/>
+      </w:pPr>
+      <w:r>
+        <w:t xml:space="preserve">Patton, A. J. (2011). Volatility forecast comparison using imperfect volatility proxies. </w:t>
+      </w:r>
+      <w:r>
+        <w:rPr>
+          <w:i/>
+        </w:rPr>
+        <w:t>Journal of Econometrics</w:t>
+      </w:r>
+      <w:r>
+        <w:t xml:space="preserve"> 160(1), 246–256.</w:t>
+      </w:r>
+    </w:p>
+    <w:p>
+      <w:pPr>
+        <w:jc w:val="both"/>
+      </w:pPr>
+      <w:r>
+        <w:t>Tandon, A., et al. (2025). Quantum reservoir computing for corrosion prediction in aerospace: a hybrid approach for enhanced material degradation forecasting. arXiv:2505.22837.</w:t>
+      </w:r>
+    </w:p>
+    <w:p>
+      <w:pPr>
+        <w:jc w:val="both"/>
+      </w:pPr>
+      <w:r>
+        <w:t xml:space="preserve">Zhu, C., et al. (2025). Minimalistic and scalable quantum reservoir computing enhanced with feedback. </w:t>
+      </w:r>
+      <w:r>
+        <w:rPr>
+          <w:i/>
+        </w:rPr>
+        <w:t>npj Quantum Information</w:t>
+      </w:r>
+      <w:r>
+        <w:t xml:space="preserve"> 11; arXiv:2412.17817.</w:t>
       </w:r>
     </w:p>
     <w:sectPr>

</xml_diff>